<commit_message>
Update run app UI and project files
</commit_message>
<xml_diff>
--- a/Napfa5 app upgrade suggestions.docx
+++ b/Napfa5 app upgrade suggestions.docx
@@ -566,7 +566,7 @@
           <w14:ligatures w14:val="none"/>
         </w:rPr>
         <w:pict w14:anchorId="61731E9B">
-          <v:rect id="_x0000_i1118" style="width:0;height:1.5pt" o:hralign="center" o:hrstd="t" o:hr="t" fillcolor="#a0a0a0" stroked="f"/>
+          <v:rect id="_x0000_i1025" style="width:0;height:1.5pt" o:hralign="center" o:hrstd="t" o:hr="t" fillcolor="#a0a0a0" stroked="f"/>
         </w:pict>
       </w:r>
     </w:p>
@@ -888,7 +888,7 @@
           <w14:ligatures w14:val="none"/>
         </w:rPr>
         <w:pict w14:anchorId="186A1114">
-          <v:rect id="_x0000_i1119" style="width:0;height:1.5pt" o:hralign="center" o:hrstd="t" o:hr="t" fillcolor="#a0a0a0" stroked="f"/>
+          <v:rect id="_x0000_i1026" style="width:0;height:1.5pt" o:hralign="center" o:hrstd="t" o:hr="t" fillcolor="#a0a0a0" stroked="f"/>
         </w:pict>
       </w:r>
     </w:p>
@@ -1391,7 +1391,7 @@
           <w14:ligatures w14:val="none"/>
         </w:rPr>
         <w:pict w14:anchorId="381DEDE7">
-          <v:rect id="_x0000_i1120" style="width:0;height:1.5pt" o:hralign="center" o:hrstd="t" o:hr="t" fillcolor="#a0a0a0" stroked="f"/>
+          <v:rect id="_x0000_i1027" style="width:0;height:1.5pt" o:hralign="center" o:hrstd="t" o:hr="t" fillcolor="#a0a0a0" stroked="f"/>
         </w:pict>
       </w:r>
     </w:p>
@@ -2060,7 +2060,7 @@
           <w14:ligatures w14:val="none"/>
         </w:rPr>
         <w:pict w14:anchorId="6F3C9540">
-          <v:rect id="_x0000_i1121" style="width:0;height:1.5pt" o:hralign="center" o:hrstd="t" o:hr="t" fillcolor="#a0a0a0" stroked="f"/>
+          <v:rect id="_x0000_i1028" style="width:0;height:1.5pt" o:hralign="center" o:hrstd="t" o:hr="t" fillcolor="#a0a0a0" stroked="f"/>
         </w:pict>
       </w:r>
     </w:p>
@@ -2471,7 +2471,7 @@
           <w14:ligatures w14:val="none"/>
         </w:rPr>
         <w:pict w14:anchorId="0236AC65">
-          <v:rect id="_x0000_i1122" style="width:0;height:1.5pt" o:hralign="center" o:hrstd="t" o:hr="t" fillcolor="#a0a0a0" stroked="f"/>
+          <v:rect id="_x0000_i1029" style="width:0;height:1.5pt" o:hralign="center" o:hrstd="t" o:hr="t" fillcolor="#a0a0a0" stroked="f"/>
         </w:pict>
       </w:r>
     </w:p>
@@ -2820,7 +2820,7 @@
           <w14:ligatures w14:val="none"/>
         </w:rPr>
         <w:pict w14:anchorId="068040CA">
-          <v:rect id="_x0000_i1123" style="width:0;height:1.5pt" o:hralign="center" o:hrstd="t" o:hr="t" fillcolor="#a0a0a0" stroked="f"/>
+          <v:rect id="_x0000_i1030" style="width:0;height:1.5pt" o:hralign="center" o:hrstd="t" o:hr="t" fillcolor="#a0a0a0" stroked="f"/>
         </w:pict>
       </w:r>
     </w:p>
@@ -3852,7 +3852,7 @@
           <w14:ligatures w14:val="none"/>
         </w:rPr>
         <w:pict w14:anchorId="28AB327B">
-          <v:rect id="_x0000_i1025" style="width:0;height:1.5pt" o:hralign="center" o:hrstd="t" o:hr="t" fillcolor="#a0a0a0" stroked="f"/>
+          <v:rect id="_x0000_i1031" style="width:0;height:1.5pt" o:hralign="center" o:hrstd="t" o:hr="t" fillcolor="#a0a0a0" stroked="f"/>
         </w:pict>
       </w:r>
     </w:p>
@@ -5142,7 +5142,7 @@
           <w14:ligatures w14:val="none"/>
         </w:rPr>
         <w:pict w14:anchorId="4ABC6E2D">
-          <v:rect id="_x0000_i1026" style="width:0;height:1.5pt" o:hralign="center" o:hrstd="t" o:hr="t" fillcolor="#a0a0a0" stroked="f"/>
+          <v:rect id="_x0000_i1032" style="width:0;height:1.5pt" o:hralign="center" o:hrstd="t" o:hr="t" fillcolor="#a0a0a0" stroked="f"/>
         </w:pict>
       </w:r>
     </w:p>
@@ -5421,7 +5421,7 @@
           <w14:ligatures w14:val="none"/>
         </w:rPr>
         <w:pict w14:anchorId="39DB97DA">
-          <v:rect id="_x0000_i1027" style="width:0;height:1.5pt" o:hralign="center" o:hrstd="t" o:hr="t" fillcolor="#a0a0a0" stroked="f"/>
+          <v:rect id="_x0000_i1033" style="width:0;height:1.5pt" o:hralign="center" o:hrstd="t" o:hr="t" fillcolor="#a0a0a0" stroked="f"/>
         </w:pict>
       </w:r>
     </w:p>
@@ -5768,7 +5768,7 @@
           <w14:ligatures w14:val="none"/>
         </w:rPr>
         <w:pict w14:anchorId="385D686D">
-          <v:rect id="_x0000_i1028" style="width:0;height:1.5pt" o:hralign="center" o:hrstd="t" o:hr="t" fillcolor="#a0a0a0" stroked="f"/>
+          <v:rect id="_x0000_i1034" style="width:0;height:1.5pt" o:hralign="center" o:hrstd="t" o:hr="t" fillcolor="#a0a0a0" stroked="f"/>
         </w:pict>
       </w:r>
     </w:p>
@@ -5990,7 +5990,7 @@
           <w14:ligatures w14:val="none"/>
         </w:rPr>
         <w:pict w14:anchorId="727BFC74">
-          <v:rect id="_x0000_i1029" style="width:0;height:1.5pt" o:hralign="center" o:hrstd="t" o:hr="t" fillcolor="#a0a0a0" stroked="f"/>
+          <v:rect id="_x0000_i1035" style="width:0;height:1.5pt" o:hralign="center" o:hrstd="t" o:hr="t" fillcolor="#a0a0a0" stroked="f"/>
         </w:pict>
       </w:r>
     </w:p>
@@ -6907,7 +6907,7 @@
           <w:szCs w:val="18"/>
         </w:rPr>
         <w:pict w14:anchorId="143CF443">
-          <v:rect id="_x0000_i1106" style="width:0;height:1.5pt" o:hralign="center" o:hrstd="t" o:hr="t" fillcolor="#a0a0a0" stroked="f"/>
+          <v:rect id="_x0000_i1036" style="width:0;height:1.5pt" o:hralign="center" o:hrstd="t" o:hr="t" fillcolor="#a0a0a0" stroked="f"/>
         </w:pict>
       </w:r>
     </w:p>
@@ -7085,7 +7085,7 @@
           <w:szCs w:val="18"/>
         </w:rPr>
         <w:pict w14:anchorId="017360FF">
-          <v:rect id="_x0000_i1107" style="width:0;height:1.5pt" o:hralign="center" o:hrstd="t" o:hr="t" fillcolor="#a0a0a0" stroked="f"/>
+          <v:rect id="_x0000_i1037" style="width:0;height:1.5pt" o:hralign="center" o:hrstd="t" o:hr="t" fillcolor="#a0a0a0" stroked="f"/>
         </w:pict>
       </w:r>
     </w:p>
@@ -7271,7 +7271,7 @@
           <w:szCs w:val="18"/>
         </w:rPr>
         <w:pict w14:anchorId="425CC205">
-          <v:rect id="_x0000_i1108" style="width:0;height:1.5pt" o:hralign="center" o:hrstd="t" o:hr="t" fillcolor="#a0a0a0" stroked="f"/>
+          <v:rect id="_x0000_i1038" style="width:0;height:1.5pt" o:hralign="center" o:hrstd="t" o:hr="t" fillcolor="#a0a0a0" stroked="f"/>
         </w:pict>
       </w:r>
     </w:p>
@@ -7457,7 +7457,7 @@
           <w:szCs w:val="18"/>
         </w:rPr>
         <w:pict w14:anchorId="7B8C1A2C">
-          <v:rect id="_x0000_i1109" style="width:0;height:1.5pt" o:hralign="center" o:hrstd="t" o:hr="t" fillcolor="#a0a0a0" stroked="f"/>
+          <v:rect id="_x0000_i1039" style="width:0;height:1.5pt" o:hralign="center" o:hrstd="t" o:hr="t" fillcolor="#a0a0a0" stroked="f"/>
         </w:pict>
       </w:r>
     </w:p>
@@ -7627,7 +7627,7 @@
           <w:szCs w:val="18"/>
         </w:rPr>
         <w:pict w14:anchorId="48D505EA">
-          <v:rect id="_x0000_i1110" style="width:0;height:1.5pt" o:hralign="center" o:hrstd="t" o:hr="t" fillcolor="#a0a0a0" stroked="f"/>
+          <v:rect id="_x0000_i1040" style="width:0;height:1.5pt" o:hralign="center" o:hrstd="t" o:hr="t" fillcolor="#a0a0a0" stroked="f"/>
         </w:pict>
       </w:r>
     </w:p>
@@ -7774,7 +7774,7 @@
           <w:szCs w:val="18"/>
         </w:rPr>
         <w:pict w14:anchorId="2F50CCA2">
-          <v:rect id="_x0000_i1111" style="width:0;height:1.5pt" o:hralign="center" o:hrstd="t" o:hr="t" fillcolor="#a0a0a0" stroked="f"/>
+          <v:rect id="_x0000_i1041" style="width:0;height:1.5pt" o:hralign="center" o:hrstd="t" o:hr="t" fillcolor="#a0a0a0" stroked="f"/>
         </w:pict>
       </w:r>
     </w:p>
@@ -7880,7 +7880,1079 @@
     </w:p>
     <w:p>
       <w:pPr>
-        <w:spacing w:after="0"/>
+        <w:rPr>
+          <w:sz w:val="18"/>
+          <w:szCs w:val="18"/>
+        </w:rPr>
+      </w:pPr>
+      <w:r>
+        <w:rPr>
+          <w:sz w:val="18"/>
+          <w:szCs w:val="18"/>
+        </w:rPr>
+        <w:br w:type="page"/>
+      </w:r>
+    </w:p>
+    <w:p>
+      <w:pPr>
+        <w:rPr>
+          <w:sz w:val="18"/>
+          <w:szCs w:val="18"/>
+        </w:rPr>
+      </w:pPr>
+      <w:r>
+        <w:rPr>
+          <w:sz w:val="18"/>
+          <w:szCs w:val="18"/>
+        </w:rPr>
+        <w:lastRenderedPageBreak/>
+        <w:t>Gemini Suggestions</w:t>
+      </w:r>
+    </w:p>
+    <w:p>
+      <w:pPr>
+        <w:rPr>
+          <w:sz w:val="18"/>
+          <w:szCs w:val="18"/>
+        </w:rPr>
+      </w:pPr>
+      <w:r>
+        <w:rPr>
+          <w:sz w:val="18"/>
+          <w:szCs w:val="18"/>
+        </w:rPr>
+        <w:t xml:space="preserve">To make NAPFA less of a chore and more of a fitness journey, the app needs to bridge the gap between </w:t>
+      </w:r>
+      <w:r>
+        <w:rPr>
+          <w:b/>
+          <w:bCs/>
+          <w:sz w:val="18"/>
+          <w:szCs w:val="18"/>
+        </w:rPr>
+        <w:t>data collection</w:t>
+      </w:r>
+      <w:r>
+        <w:rPr>
+          <w:sz w:val="18"/>
+          <w:szCs w:val="18"/>
+        </w:rPr>
+        <w:t xml:space="preserve"> and </w:t>
+      </w:r>
+      <w:r>
+        <w:rPr>
+          <w:b/>
+          <w:bCs/>
+          <w:sz w:val="18"/>
+          <w:szCs w:val="18"/>
+        </w:rPr>
+        <w:t>personal growth.</w:t>
+      </w:r>
+    </w:p>
+    <w:p>
+      <w:pPr>
+        <w:rPr>
+          <w:sz w:val="18"/>
+          <w:szCs w:val="18"/>
+        </w:rPr>
+      </w:pPr>
+      <w:r>
+        <w:rPr>
+          <w:sz w:val="18"/>
+          <w:szCs w:val="18"/>
+        </w:rPr>
+        <w:pict w14:anchorId="524E809F">
+          <v:rect id="_x0000_i1054" style="width:0;height:1.5pt" o:hralign="center" o:hrstd="t" o:hr="t" fillcolor="#a0a0a0" stroked="f"/>
+        </w:pict>
+      </w:r>
+    </w:p>
+    <w:p>
+      <w:pPr>
+        <w:rPr>
+          <w:b/>
+          <w:bCs/>
+          <w:sz w:val="18"/>
+          <w:szCs w:val="18"/>
+        </w:rPr>
+      </w:pPr>
+      <w:r>
+        <w:rPr>
+          <w:b/>
+          <w:bCs/>
+          <w:sz w:val="18"/>
+          <w:szCs w:val="18"/>
+        </w:rPr>
+        <w:t>1. Gamification: Turning Scores into Progress</w:t>
+      </w:r>
+    </w:p>
+    <w:p>
+      <w:pPr>
+        <w:rPr>
+          <w:sz w:val="18"/>
+          <w:szCs w:val="18"/>
+        </w:rPr>
+      </w:pPr>
+      <w:r>
+        <w:rPr>
+          <w:sz w:val="18"/>
+          <w:szCs w:val="18"/>
+        </w:rPr>
+        <w:t xml:space="preserve">Instead of just seeing a "C" or a "B," students should feel like they are </w:t>
+      </w:r>
+      <w:proofErr w:type="spellStart"/>
+      <w:r>
+        <w:rPr>
+          <w:sz w:val="18"/>
+          <w:szCs w:val="18"/>
+        </w:rPr>
+        <w:t>leveling</w:t>
+      </w:r>
+      <w:proofErr w:type="spellEnd"/>
+      <w:r>
+        <w:rPr>
+          <w:sz w:val="18"/>
+          <w:szCs w:val="18"/>
+        </w:rPr>
+        <w:t xml:space="preserve"> up a character (themselves).</w:t>
+      </w:r>
+    </w:p>
+    <w:p>
+      <w:pPr>
+        <w:numPr>
+          <w:ilvl w:val="0"/>
+          <w:numId w:val="56"/>
+        </w:numPr>
+        <w:rPr>
+          <w:sz w:val="18"/>
+          <w:szCs w:val="18"/>
+        </w:rPr>
+      </w:pPr>
+      <w:r>
+        <w:rPr>
+          <w:b/>
+          <w:bCs/>
+          <w:sz w:val="18"/>
+          <w:szCs w:val="18"/>
+        </w:rPr>
+        <w:t>The "Spider Chart" Avatar:</w:t>
+      </w:r>
+      <w:r>
+        <w:rPr>
+          <w:sz w:val="18"/>
+          <w:szCs w:val="18"/>
+        </w:rPr>
+        <w:t xml:space="preserve"> Create a visual pentagon or hexagon (radar chart) based on the stations. As their Sit-and-Reach improves, that corner of their "shield" or "aura" expands.</w:t>
+      </w:r>
+    </w:p>
+    <w:p>
+      <w:pPr>
+        <w:numPr>
+          <w:ilvl w:val="0"/>
+          <w:numId w:val="56"/>
+        </w:numPr>
+        <w:rPr>
+          <w:sz w:val="18"/>
+          <w:szCs w:val="18"/>
+        </w:rPr>
+      </w:pPr>
+      <w:r>
+        <w:rPr>
+          <w:b/>
+          <w:bCs/>
+          <w:sz w:val="18"/>
+          <w:szCs w:val="18"/>
+        </w:rPr>
+        <w:t xml:space="preserve">XP &amp; </w:t>
+      </w:r>
+      <w:proofErr w:type="spellStart"/>
+      <w:r>
+        <w:rPr>
+          <w:b/>
+          <w:bCs/>
+          <w:sz w:val="18"/>
+          <w:szCs w:val="18"/>
+        </w:rPr>
+        <w:t>Leveling</w:t>
+      </w:r>
+      <w:proofErr w:type="spellEnd"/>
+      <w:r>
+        <w:rPr>
+          <w:b/>
+          <w:bCs/>
+          <w:sz w:val="18"/>
+          <w:szCs w:val="18"/>
+        </w:rPr>
+        <w:t>:</w:t>
+      </w:r>
+      <w:r>
+        <w:rPr>
+          <w:sz w:val="18"/>
+          <w:szCs w:val="18"/>
+        </w:rPr>
+        <w:t xml:space="preserve"> Every test attempt or practice session earns Experience Points (XP). Reaching a "Silver" level could unlock a special badge or a custom app skin.</w:t>
+      </w:r>
+    </w:p>
+    <w:p>
+      <w:pPr>
+        <w:numPr>
+          <w:ilvl w:val="0"/>
+          <w:numId w:val="56"/>
+        </w:numPr>
+        <w:rPr>
+          <w:sz w:val="18"/>
+          <w:szCs w:val="18"/>
+        </w:rPr>
+      </w:pPr>
+      <w:r>
+        <w:rPr>
+          <w:b/>
+          <w:bCs/>
+          <w:sz w:val="18"/>
+          <w:szCs w:val="18"/>
+        </w:rPr>
+        <w:t>Leaderboards (Group vs. Group):</w:t>
+      </w:r>
+      <w:r>
+        <w:rPr>
+          <w:sz w:val="18"/>
+          <w:szCs w:val="18"/>
+        </w:rPr>
+        <w:t xml:space="preserve"> Avoid individual shaming by focusing on </w:t>
+      </w:r>
+      <w:r>
+        <w:rPr>
+          <w:b/>
+          <w:bCs/>
+          <w:sz w:val="18"/>
+          <w:szCs w:val="18"/>
+        </w:rPr>
+        <w:t>class averages</w:t>
+      </w:r>
+      <w:r>
+        <w:rPr>
+          <w:sz w:val="18"/>
+          <w:szCs w:val="18"/>
+        </w:rPr>
+        <w:t xml:space="preserve"> or </w:t>
+      </w:r>
+      <w:r>
+        <w:rPr>
+          <w:b/>
+          <w:bCs/>
+          <w:sz w:val="18"/>
+          <w:szCs w:val="18"/>
+        </w:rPr>
+        <w:t>"Most Improved"</w:t>
+      </w:r>
+      <w:r>
+        <w:rPr>
+          <w:sz w:val="18"/>
+          <w:szCs w:val="18"/>
+        </w:rPr>
+        <w:t xml:space="preserve"> categories. Classes could compete to see who has the highest total "Sit-up" count for the week.</w:t>
+      </w:r>
+    </w:p>
+    <w:p>
+      <w:pPr>
+        <w:numPr>
+          <w:ilvl w:val="0"/>
+          <w:numId w:val="56"/>
+        </w:numPr>
+        <w:rPr>
+          <w:sz w:val="18"/>
+          <w:szCs w:val="18"/>
+        </w:rPr>
+      </w:pPr>
+      <w:r>
+        <w:rPr>
+          <w:b/>
+          <w:bCs/>
+          <w:sz w:val="18"/>
+          <w:szCs w:val="18"/>
+        </w:rPr>
+        <w:t>Streak Tracking:</w:t>
+      </w:r>
+      <w:r>
+        <w:rPr>
+          <w:sz w:val="18"/>
+          <w:szCs w:val="18"/>
+        </w:rPr>
+        <w:t xml:space="preserve"> If the app allows for practice entries, reward "Consistency Streaks." Doing 5 minutes of stretching 3 days in a row earns a "Flexibility Streak."</w:t>
+      </w:r>
+    </w:p>
+    <w:p>
+      <w:pPr>
+        <w:rPr>
+          <w:b/>
+          <w:bCs/>
+          <w:sz w:val="18"/>
+          <w:szCs w:val="18"/>
+        </w:rPr>
+      </w:pPr>
+      <w:r>
+        <w:rPr>
+          <w:b/>
+          <w:bCs/>
+          <w:sz w:val="18"/>
+          <w:szCs w:val="18"/>
+        </w:rPr>
+        <w:t>2. Educational Objectives: The "Why" Behind the Test</w:t>
+      </w:r>
+    </w:p>
+    <w:p>
+      <w:pPr>
+        <w:rPr>
+          <w:sz w:val="18"/>
+          <w:szCs w:val="18"/>
+        </w:rPr>
+      </w:pPr>
+      <w:r>
+        <w:rPr>
+          <w:sz w:val="18"/>
+          <w:szCs w:val="18"/>
+        </w:rPr>
+        <w:t>Most students do the tests without knowing what they measure. The app can turn data into a biology lesson.</w:t>
+      </w:r>
+    </w:p>
+    <w:p>
+      <w:pPr>
+        <w:numPr>
+          <w:ilvl w:val="0"/>
+          <w:numId w:val="57"/>
+        </w:numPr>
+        <w:rPr>
+          <w:sz w:val="18"/>
+          <w:szCs w:val="18"/>
+        </w:rPr>
+      </w:pPr>
+      <w:r>
+        <w:rPr>
+          <w:b/>
+          <w:bCs/>
+          <w:sz w:val="18"/>
+          <w:szCs w:val="18"/>
+        </w:rPr>
+        <w:t>Station Science:</w:t>
+      </w:r>
+      <w:r>
+        <w:rPr>
+          <w:sz w:val="18"/>
+          <w:szCs w:val="18"/>
+        </w:rPr>
+        <w:t xml:space="preserve"> When a student enters a 2.4km run score, show a 15-second "Did You Know?" pop-up: </w:t>
+      </w:r>
+      <w:r>
+        <w:rPr>
+          <w:i/>
+          <w:iCs/>
+          <w:sz w:val="18"/>
+          <w:szCs w:val="18"/>
+        </w:rPr>
+        <w:t>"This test measures your Aerobic Capacity—how well your heart and lungs deliver oxygen to your muscles!"</w:t>
+      </w:r>
+    </w:p>
+    <w:p>
+      <w:pPr>
+        <w:numPr>
+          <w:ilvl w:val="0"/>
+          <w:numId w:val="57"/>
+        </w:numPr>
+        <w:rPr>
+          <w:sz w:val="18"/>
+          <w:szCs w:val="18"/>
+        </w:rPr>
+      </w:pPr>
+      <w:r>
+        <w:rPr>
+          <w:b/>
+          <w:bCs/>
+          <w:sz w:val="18"/>
+          <w:szCs w:val="18"/>
+        </w:rPr>
+        <w:t>Personalized Form Coaching:</w:t>
+      </w:r>
+      <w:r>
+        <w:rPr>
+          <w:sz w:val="18"/>
+          <w:szCs w:val="18"/>
+        </w:rPr>
+        <w:t xml:space="preserve"> Use short GIFs or videos within the app showing perfect form for the Standing Broad Jump or Sit-ups to prevent injury and maximize scores.</w:t>
+      </w:r>
+    </w:p>
+    <w:p>
+      <w:pPr>
+        <w:numPr>
+          <w:ilvl w:val="0"/>
+          <w:numId w:val="57"/>
+        </w:numPr>
+        <w:rPr>
+          <w:sz w:val="18"/>
+          <w:szCs w:val="18"/>
+        </w:rPr>
+      </w:pPr>
+      <w:r>
+        <w:rPr>
+          <w:b/>
+          <w:bCs/>
+          <w:sz w:val="18"/>
+          <w:szCs w:val="18"/>
+        </w:rPr>
+        <w:t>Predictive Goal Setting:</w:t>
+      </w:r>
+      <w:r>
+        <w:rPr>
+          <w:sz w:val="18"/>
+          <w:szCs w:val="18"/>
+        </w:rPr>
+        <w:t xml:space="preserve"> Let students input a "Target Award" (e.g., Gold). The app calculates exactly how many more </w:t>
+      </w:r>
+      <w:proofErr w:type="spellStart"/>
+      <w:r>
+        <w:rPr>
+          <w:sz w:val="18"/>
+          <w:szCs w:val="18"/>
+        </w:rPr>
+        <w:t>centimeters</w:t>
+      </w:r>
+      <w:proofErr w:type="spellEnd"/>
+      <w:r>
+        <w:rPr>
+          <w:sz w:val="18"/>
+          <w:szCs w:val="18"/>
+        </w:rPr>
+        <w:t xml:space="preserve"> they need on their jump or seconds to shave off their run to hit that goal.</w:t>
+      </w:r>
+    </w:p>
+    <w:p>
+      <w:pPr>
+        <w:rPr>
+          <w:b/>
+          <w:bCs/>
+          <w:sz w:val="18"/>
+          <w:szCs w:val="18"/>
+        </w:rPr>
+      </w:pPr>
+      <w:r>
+        <w:rPr>
+          <w:b/>
+          <w:bCs/>
+          <w:sz w:val="18"/>
+          <w:szCs w:val="18"/>
+        </w:rPr>
+        <w:t>3. Social &amp; Community Features</w:t>
+      </w:r>
+    </w:p>
+    <w:p>
+      <w:pPr>
+        <w:rPr>
+          <w:sz w:val="18"/>
+          <w:szCs w:val="18"/>
+        </w:rPr>
+      </w:pPr>
+      <w:r>
+        <w:rPr>
+          <w:sz w:val="18"/>
+          <w:szCs w:val="18"/>
+        </w:rPr>
+        <w:t>Fitness is often more sustainable when it's social.</w:t>
+      </w:r>
+    </w:p>
+    <w:p>
+      <w:pPr>
+        <w:numPr>
+          <w:ilvl w:val="0"/>
+          <w:numId w:val="58"/>
+        </w:numPr>
+        <w:rPr>
+          <w:sz w:val="18"/>
+          <w:szCs w:val="18"/>
+        </w:rPr>
+      </w:pPr>
+      <w:r>
+        <w:rPr>
+          <w:b/>
+          <w:bCs/>
+          <w:sz w:val="18"/>
+          <w:szCs w:val="18"/>
+        </w:rPr>
+        <w:t>Digital High-Fives:</w:t>
+      </w:r>
+      <w:r>
+        <w:rPr>
+          <w:sz w:val="18"/>
+          <w:szCs w:val="18"/>
+        </w:rPr>
+        <w:t xml:space="preserve"> When a student hits a Personal Best (PB), their "buddies" in the app get a notification to send a "High-Five" reaction.</w:t>
+      </w:r>
+    </w:p>
+    <w:p>
+      <w:pPr>
+        <w:numPr>
+          <w:ilvl w:val="0"/>
+          <w:numId w:val="58"/>
+        </w:numPr>
+        <w:rPr>
+          <w:sz w:val="18"/>
+          <w:szCs w:val="18"/>
+        </w:rPr>
+      </w:pPr>
+      <w:r>
+        <w:rPr>
+          <w:b/>
+          <w:bCs/>
+          <w:sz w:val="18"/>
+          <w:szCs w:val="18"/>
+        </w:rPr>
+        <w:t>Quest Mode:</w:t>
+      </w:r>
+      <w:r>
+        <w:rPr>
+          <w:sz w:val="18"/>
+          <w:szCs w:val="18"/>
+        </w:rPr>
+        <w:t xml:space="preserve"> Set monthly challenges like </w:t>
+      </w:r>
+      <w:r>
+        <w:rPr>
+          <w:i/>
+          <w:iCs/>
+          <w:sz w:val="18"/>
+          <w:szCs w:val="18"/>
+        </w:rPr>
+        <w:t>"The 1000cm Jump Challenge"</w:t>
+      </w:r>
+      <w:r>
+        <w:rPr>
+          <w:sz w:val="18"/>
+          <w:szCs w:val="18"/>
+        </w:rPr>
+        <w:t xml:space="preserve"> where a small group of friends aggregates their Broad Jump scores to reach a collective distance goal.</w:t>
+      </w:r>
+    </w:p>
+    <w:p>
+      <w:pPr>
+        <w:rPr>
+          <w:sz w:val="18"/>
+          <w:szCs w:val="18"/>
+        </w:rPr>
+      </w:pPr>
+      <w:r>
+        <w:rPr>
+          <w:sz w:val="18"/>
+          <w:szCs w:val="18"/>
+        </w:rPr>
+        <w:pict w14:anchorId="28A922BD">
+          <v:rect id="_x0000_i1055" style="width:0;height:1.5pt" o:hralign="center" o:hrstd="t" o:hr="t" fillcolor="#a0a0a0" stroked="f"/>
+        </w:pict>
+      </w:r>
+    </w:p>
+    <w:p>
+      <w:pPr>
+        <w:rPr>
+          <w:b/>
+          <w:bCs/>
+          <w:sz w:val="18"/>
+          <w:szCs w:val="18"/>
+        </w:rPr>
+      </w:pPr>
+      <w:r>
+        <w:rPr>
+          <w:b/>
+          <w:bCs/>
+          <w:sz w:val="18"/>
+          <w:szCs w:val="18"/>
+        </w:rPr>
+        <w:t>Summary of Feature Ideas</w:t>
+      </w:r>
+    </w:p>
+    <w:tbl>
+      <w:tblPr>
+        <w:tblW w:w="0" w:type="auto"/>
+        <w:tblCellSpacing w:w="15" w:type="dxa"/>
+        <w:tblCellMar>
+          <w:top w:w="15" w:type="dxa"/>
+          <w:left w:w="15" w:type="dxa"/>
+          <w:bottom w:w="15" w:type="dxa"/>
+          <w:right w:w="15" w:type="dxa"/>
+        </w:tblCellMar>
+        <w:tblLook w:val="04A0" w:firstRow="1" w:lastRow="0" w:firstColumn="1" w:lastColumn="0" w:noHBand="0" w:noVBand="1"/>
+      </w:tblPr>
+      <w:tblGrid>
+        <w:gridCol w:w="1166"/>
+        <w:gridCol w:w="1486"/>
+        <w:gridCol w:w="5890"/>
+      </w:tblGrid>
+      <w:tr>
+        <w:trPr>
+          <w:tblHeader/>
+          <w:tblCellSpacing w:w="15" w:type="dxa"/>
+        </w:trPr>
+        <w:tc>
+          <w:tcPr>
+            <w:tcW w:w="0" w:type="auto"/>
+            <w:tcBorders>
+              <w:top w:val="single" w:sz="6" w:space="0" w:color="auto"/>
+              <w:left w:val="single" w:sz="6" w:space="0" w:color="auto"/>
+              <w:bottom w:val="single" w:sz="6" w:space="0" w:color="auto"/>
+              <w:right w:val="single" w:sz="6" w:space="0" w:color="auto"/>
+            </w:tcBorders>
+            <w:vAlign w:val="center"/>
+            <w:hideMark/>
+          </w:tcPr>
+          <w:p>
+            <w:pPr>
+              <w:rPr>
+                <w:sz w:val="18"/>
+                <w:szCs w:val="18"/>
+              </w:rPr>
+            </w:pPr>
+            <w:r>
+              <w:rPr>
+                <w:b/>
+                <w:bCs/>
+                <w:sz w:val="18"/>
+                <w:szCs w:val="18"/>
+              </w:rPr>
+              <w:t>Feature Type</w:t>
+            </w:r>
+          </w:p>
+        </w:tc>
+        <w:tc>
+          <w:tcPr>
+            <w:tcW w:w="0" w:type="auto"/>
+            <w:tcBorders>
+              <w:top w:val="single" w:sz="6" w:space="0" w:color="auto"/>
+              <w:left w:val="single" w:sz="6" w:space="0" w:color="auto"/>
+              <w:bottom w:val="single" w:sz="6" w:space="0" w:color="auto"/>
+              <w:right w:val="single" w:sz="6" w:space="0" w:color="auto"/>
+            </w:tcBorders>
+            <w:vAlign w:val="center"/>
+            <w:hideMark/>
+          </w:tcPr>
+          <w:p>
+            <w:pPr>
+              <w:rPr>
+                <w:sz w:val="18"/>
+                <w:szCs w:val="18"/>
+              </w:rPr>
+            </w:pPr>
+            <w:r>
+              <w:rPr>
+                <w:b/>
+                <w:bCs/>
+                <w:sz w:val="18"/>
+                <w:szCs w:val="18"/>
+              </w:rPr>
+              <w:t>Idea</w:t>
+            </w:r>
+          </w:p>
+        </w:tc>
+        <w:tc>
+          <w:tcPr>
+            <w:tcW w:w="0" w:type="auto"/>
+            <w:tcBorders>
+              <w:top w:val="single" w:sz="6" w:space="0" w:color="auto"/>
+              <w:left w:val="single" w:sz="6" w:space="0" w:color="auto"/>
+              <w:bottom w:val="single" w:sz="6" w:space="0" w:color="auto"/>
+              <w:right w:val="single" w:sz="6" w:space="0" w:color="auto"/>
+            </w:tcBorders>
+            <w:vAlign w:val="center"/>
+            <w:hideMark/>
+          </w:tcPr>
+          <w:p>
+            <w:pPr>
+              <w:rPr>
+                <w:sz w:val="18"/>
+                <w:szCs w:val="18"/>
+              </w:rPr>
+            </w:pPr>
+            <w:r>
+              <w:rPr>
+                <w:b/>
+                <w:bCs/>
+                <w:sz w:val="18"/>
+                <w:szCs w:val="18"/>
+              </w:rPr>
+              <w:t>Objective</w:t>
+            </w:r>
+          </w:p>
+        </w:tc>
+      </w:tr>
+      <w:tr>
+        <w:trPr>
+          <w:tblCellSpacing w:w="15" w:type="dxa"/>
+        </w:trPr>
+        <w:tc>
+          <w:tcPr>
+            <w:tcW w:w="0" w:type="auto"/>
+            <w:tcBorders>
+              <w:top w:val="single" w:sz="6" w:space="0" w:color="auto"/>
+              <w:left w:val="single" w:sz="6" w:space="0" w:color="auto"/>
+              <w:bottom w:val="single" w:sz="6" w:space="0" w:color="auto"/>
+              <w:right w:val="single" w:sz="6" w:space="0" w:color="auto"/>
+            </w:tcBorders>
+            <w:vAlign w:val="center"/>
+            <w:hideMark/>
+          </w:tcPr>
+          <w:p>
+            <w:pPr>
+              <w:rPr>
+                <w:sz w:val="18"/>
+                <w:szCs w:val="18"/>
+              </w:rPr>
+            </w:pPr>
+            <w:r>
+              <w:rPr>
+                <w:b/>
+                <w:bCs/>
+                <w:sz w:val="18"/>
+                <w:szCs w:val="18"/>
+              </w:rPr>
+              <w:t>Gamification</w:t>
+            </w:r>
+          </w:p>
+        </w:tc>
+        <w:tc>
+          <w:tcPr>
+            <w:tcW w:w="0" w:type="auto"/>
+            <w:tcBorders>
+              <w:top w:val="single" w:sz="6" w:space="0" w:color="auto"/>
+              <w:left w:val="single" w:sz="6" w:space="0" w:color="auto"/>
+              <w:bottom w:val="single" w:sz="6" w:space="0" w:color="auto"/>
+              <w:right w:val="single" w:sz="6" w:space="0" w:color="auto"/>
+            </w:tcBorders>
+            <w:vAlign w:val="center"/>
+            <w:hideMark/>
+          </w:tcPr>
+          <w:p>
+            <w:pPr>
+              <w:rPr>
+                <w:sz w:val="18"/>
+                <w:szCs w:val="18"/>
+              </w:rPr>
+            </w:pPr>
+            <w:r>
+              <w:rPr>
+                <w:b/>
+                <w:bCs/>
+                <w:sz w:val="18"/>
+                <w:szCs w:val="18"/>
+              </w:rPr>
+              <w:t>Fitness Tiers</w:t>
+            </w:r>
+          </w:p>
+        </w:tc>
+        <w:tc>
+          <w:tcPr>
+            <w:tcW w:w="0" w:type="auto"/>
+            <w:tcBorders>
+              <w:top w:val="single" w:sz="6" w:space="0" w:color="auto"/>
+              <w:left w:val="single" w:sz="6" w:space="0" w:color="auto"/>
+              <w:bottom w:val="single" w:sz="6" w:space="0" w:color="auto"/>
+              <w:right w:val="single" w:sz="6" w:space="0" w:color="auto"/>
+            </w:tcBorders>
+            <w:vAlign w:val="center"/>
+            <w:hideMark/>
+          </w:tcPr>
+          <w:p>
+            <w:pPr>
+              <w:rPr>
+                <w:sz w:val="18"/>
+                <w:szCs w:val="18"/>
+              </w:rPr>
+            </w:pPr>
+            <w:r>
+              <w:rPr>
+                <w:sz w:val="18"/>
+                <w:szCs w:val="18"/>
+              </w:rPr>
+              <w:t>Move from "Pass/Fail" to "Bronze, Silver, Gold, Platinum" tiers.</w:t>
+            </w:r>
+          </w:p>
+        </w:tc>
+      </w:tr>
+      <w:tr>
+        <w:trPr>
+          <w:tblCellSpacing w:w="15" w:type="dxa"/>
+        </w:trPr>
+        <w:tc>
+          <w:tcPr>
+            <w:tcW w:w="0" w:type="auto"/>
+            <w:tcBorders>
+              <w:top w:val="single" w:sz="6" w:space="0" w:color="auto"/>
+              <w:left w:val="single" w:sz="6" w:space="0" w:color="auto"/>
+              <w:bottom w:val="single" w:sz="6" w:space="0" w:color="auto"/>
+              <w:right w:val="single" w:sz="6" w:space="0" w:color="auto"/>
+            </w:tcBorders>
+            <w:vAlign w:val="center"/>
+            <w:hideMark/>
+          </w:tcPr>
+          <w:p>
+            <w:pPr>
+              <w:rPr>
+                <w:sz w:val="18"/>
+                <w:szCs w:val="18"/>
+              </w:rPr>
+            </w:pPr>
+            <w:r>
+              <w:rPr>
+                <w:b/>
+                <w:bCs/>
+                <w:sz w:val="18"/>
+                <w:szCs w:val="18"/>
+              </w:rPr>
+              <w:t>Education</w:t>
+            </w:r>
+          </w:p>
+        </w:tc>
+        <w:tc>
+          <w:tcPr>
+            <w:tcW w:w="0" w:type="auto"/>
+            <w:tcBorders>
+              <w:top w:val="single" w:sz="6" w:space="0" w:color="auto"/>
+              <w:left w:val="single" w:sz="6" w:space="0" w:color="auto"/>
+              <w:bottom w:val="single" w:sz="6" w:space="0" w:color="auto"/>
+              <w:right w:val="single" w:sz="6" w:space="0" w:color="auto"/>
+            </w:tcBorders>
+            <w:vAlign w:val="center"/>
+            <w:hideMark/>
+          </w:tcPr>
+          <w:p>
+            <w:pPr>
+              <w:rPr>
+                <w:sz w:val="18"/>
+                <w:szCs w:val="18"/>
+              </w:rPr>
+            </w:pPr>
+            <w:r>
+              <w:rPr>
+                <w:b/>
+                <w:bCs/>
+                <w:sz w:val="18"/>
+                <w:szCs w:val="18"/>
+              </w:rPr>
+              <w:t>The 'Muscle Map'</w:t>
+            </w:r>
+          </w:p>
+        </w:tc>
+        <w:tc>
+          <w:tcPr>
+            <w:tcW w:w="0" w:type="auto"/>
+            <w:tcBorders>
+              <w:top w:val="single" w:sz="6" w:space="0" w:color="auto"/>
+              <w:left w:val="single" w:sz="6" w:space="0" w:color="auto"/>
+              <w:bottom w:val="single" w:sz="6" w:space="0" w:color="auto"/>
+              <w:right w:val="single" w:sz="6" w:space="0" w:color="auto"/>
+            </w:tcBorders>
+            <w:vAlign w:val="center"/>
+            <w:hideMark/>
+          </w:tcPr>
+          <w:p>
+            <w:pPr>
+              <w:rPr>
+                <w:sz w:val="18"/>
+                <w:szCs w:val="18"/>
+              </w:rPr>
+            </w:pPr>
+            <w:r>
+              <w:rPr>
+                <w:sz w:val="18"/>
+                <w:szCs w:val="18"/>
+              </w:rPr>
+              <w:t>Highlight which muscles are used for each station (e.g., Core for Sit-ups).</w:t>
+            </w:r>
+          </w:p>
+        </w:tc>
+      </w:tr>
+      <w:tr>
+        <w:trPr>
+          <w:tblCellSpacing w:w="15" w:type="dxa"/>
+        </w:trPr>
+        <w:tc>
+          <w:tcPr>
+            <w:tcW w:w="0" w:type="auto"/>
+            <w:tcBorders>
+              <w:top w:val="single" w:sz="6" w:space="0" w:color="auto"/>
+              <w:left w:val="single" w:sz="6" w:space="0" w:color="auto"/>
+              <w:bottom w:val="single" w:sz="6" w:space="0" w:color="auto"/>
+              <w:right w:val="single" w:sz="6" w:space="0" w:color="auto"/>
+            </w:tcBorders>
+            <w:vAlign w:val="center"/>
+            <w:hideMark/>
+          </w:tcPr>
+          <w:p>
+            <w:pPr>
+              <w:rPr>
+                <w:sz w:val="18"/>
+                <w:szCs w:val="18"/>
+              </w:rPr>
+            </w:pPr>
+            <w:r>
+              <w:rPr>
+                <w:b/>
+                <w:bCs/>
+                <w:sz w:val="18"/>
+                <w:szCs w:val="18"/>
+              </w:rPr>
+              <w:t>Motivation</w:t>
+            </w:r>
+          </w:p>
+        </w:tc>
+        <w:tc>
+          <w:tcPr>
+            <w:tcW w:w="0" w:type="auto"/>
+            <w:tcBorders>
+              <w:top w:val="single" w:sz="6" w:space="0" w:color="auto"/>
+              <w:left w:val="single" w:sz="6" w:space="0" w:color="auto"/>
+              <w:bottom w:val="single" w:sz="6" w:space="0" w:color="auto"/>
+              <w:right w:val="single" w:sz="6" w:space="0" w:color="auto"/>
+            </w:tcBorders>
+            <w:vAlign w:val="center"/>
+            <w:hideMark/>
+          </w:tcPr>
+          <w:p>
+            <w:pPr>
+              <w:rPr>
+                <w:sz w:val="18"/>
+                <w:szCs w:val="18"/>
+              </w:rPr>
+            </w:pPr>
+            <w:r>
+              <w:rPr>
+                <w:b/>
+                <w:bCs/>
+                <w:sz w:val="18"/>
+                <w:szCs w:val="18"/>
+              </w:rPr>
+              <w:t>PB Celebrations</w:t>
+            </w:r>
+          </w:p>
+        </w:tc>
+        <w:tc>
+          <w:tcPr>
+            <w:tcW w:w="0" w:type="auto"/>
+            <w:tcBorders>
+              <w:top w:val="single" w:sz="6" w:space="0" w:color="auto"/>
+              <w:left w:val="single" w:sz="6" w:space="0" w:color="auto"/>
+              <w:bottom w:val="single" w:sz="6" w:space="0" w:color="auto"/>
+              <w:right w:val="single" w:sz="6" w:space="0" w:color="auto"/>
+            </w:tcBorders>
+            <w:vAlign w:val="center"/>
+            <w:hideMark/>
+          </w:tcPr>
+          <w:p>
+            <w:pPr>
+              <w:rPr>
+                <w:sz w:val="18"/>
+                <w:szCs w:val="18"/>
+              </w:rPr>
+            </w:pPr>
+            <w:r>
+              <w:rPr>
+                <w:sz w:val="18"/>
+                <w:szCs w:val="18"/>
+              </w:rPr>
+              <w:t>Confetti animation and "Level Up" sounds when a previous score is beaten.</w:t>
+            </w:r>
+          </w:p>
+        </w:tc>
+      </w:tr>
+      <w:tr>
+        <w:trPr>
+          <w:tblCellSpacing w:w="15" w:type="dxa"/>
+        </w:trPr>
+        <w:tc>
+          <w:tcPr>
+            <w:tcW w:w="0" w:type="auto"/>
+            <w:tcBorders>
+              <w:top w:val="single" w:sz="6" w:space="0" w:color="auto"/>
+              <w:left w:val="single" w:sz="6" w:space="0" w:color="auto"/>
+              <w:bottom w:val="single" w:sz="6" w:space="0" w:color="auto"/>
+              <w:right w:val="single" w:sz="6" w:space="0" w:color="auto"/>
+            </w:tcBorders>
+            <w:vAlign w:val="center"/>
+            <w:hideMark/>
+          </w:tcPr>
+          <w:p>
+            <w:pPr>
+              <w:rPr>
+                <w:sz w:val="18"/>
+                <w:szCs w:val="18"/>
+              </w:rPr>
+            </w:pPr>
+            <w:r>
+              <w:rPr>
+                <w:b/>
+                <w:bCs/>
+                <w:sz w:val="18"/>
+                <w:szCs w:val="18"/>
+              </w:rPr>
+              <w:t>Utility</w:t>
+            </w:r>
+          </w:p>
+        </w:tc>
+        <w:tc>
+          <w:tcPr>
+            <w:tcW w:w="0" w:type="auto"/>
+            <w:tcBorders>
+              <w:top w:val="single" w:sz="6" w:space="0" w:color="auto"/>
+              <w:left w:val="single" w:sz="6" w:space="0" w:color="auto"/>
+              <w:bottom w:val="single" w:sz="6" w:space="0" w:color="auto"/>
+              <w:right w:val="single" w:sz="6" w:space="0" w:color="auto"/>
+            </w:tcBorders>
+            <w:vAlign w:val="center"/>
+            <w:hideMark/>
+          </w:tcPr>
+          <w:p>
+            <w:pPr>
+              <w:rPr>
+                <w:sz w:val="18"/>
+                <w:szCs w:val="18"/>
+              </w:rPr>
+            </w:pPr>
+            <w:r>
+              <w:rPr>
+                <w:b/>
+                <w:bCs/>
+                <w:sz w:val="18"/>
+                <w:szCs w:val="18"/>
+              </w:rPr>
+              <w:t>Recovery Timer</w:t>
+            </w:r>
+          </w:p>
+        </w:tc>
+        <w:tc>
+          <w:tcPr>
+            <w:tcW w:w="0" w:type="auto"/>
+            <w:tcBorders>
+              <w:top w:val="single" w:sz="6" w:space="0" w:color="auto"/>
+              <w:left w:val="single" w:sz="6" w:space="0" w:color="auto"/>
+              <w:bottom w:val="single" w:sz="6" w:space="0" w:color="auto"/>
+              <w:right w:val="single" w:sz="6" w:space="0" w:color="auto"/>
+            </w:tcBorders>
+            <w:vAlign w:val="center"/>
+            <w:hideMark/>
+          </w:tcPr>
+          <w:p>
+            <w:pPr>
+              <w:rPr>
+                <w:sz w:val="18"/>
+                <w:szCs w:val="18"/>
+              </w:rPr>
+            </w:pPr>
+            <w:r>
+              <w:rPr>
+                <w:sz w:val="18"/>
+                <w:szCs w:val="18"/>
+              </w:rPr>
+              <w:t>A built-in timer between stations to teach the importance of rest.</w:t>
+            </w:r>
+          </w:p>
+        </w:tc>
+      </w:tr>
+    </w:tbl>
+    <w:p>
+      <w:pPr>
         <w:rPr>
           <w:sz w:val="18"/>
           <w:szCs w:val="18"/>
@@ -8496,6 +9568,155 @@
     </w:lvl>
   </w:abstractNum>
   <w:abstractNum w:abstractNumId="4" w15:restartNumberingAfterBreak="0">
+    <w:nsid w:val="090657CC"/>
+    <w:multiLevelType w:val="multilevel"/>
+    <w:tmpl w:val="D36ED022"/>
+    <w:lvl w:ilvl="0">
+      <w:start w:val="1"/>
+      <w:numFmt w:val="bullet"/>
+      <w:lvlText w:val=""/>
+      <w:lvlJc w:val="left"/>
+      <w:pPr>
+        <w:tabs>
+          <w:tab w:val="num" w:pos="720"/>
+        </w:tabs>
+        <w:ind w:left="720" w:hanging="360"/>
+      </w:pPr>
+      <w:rPr>
+        <w:rFonts w:ascii="Symbol" w:hAnsi="Symbol" w:hint="default"/>
+        <w:sz w:val="20"/>
+      </w:rPr>
+    </w:lvl>
+    <w:lvl w:ilvl="1" w:tentative="1">
+      <w:start w:val="1"/>
+      <w:numFmt w:val="bullet"/>
+      <w:lvlText w:val="o"/>
+      <w:lvlJc w:val="left"/>
+      <w:pPr>
+        <w:tabs>
+          <w:tab w:val="num" w:pos="1440"/>
+        </w:tabs>
+        <w:ind w:left="1440" w:hanging="360"/>
+      </w:pPr>
+      <w:rPr>
+        <w:rFonts w:ascii="Courier New" w:hAnsi="Courier New" w:hint="default"/>
+        <w:sz w:val="20"/>
+      </w:rPr>
+    </w:lvl>
+    <w:lvl w:ilvl="2" w:tentative="1">
+      <w:start w:val="1"/>
+      <w:numFmt w:val="bullet"/>
+      <w:lvlText w:val=""/>
+      <w:lvlJc w:val="left"/>
+      <w:pPr>
+        <w:tabs>
+          <w:tab w:val="num" w:pos="2160"/>
+        </w:tabs>
+        <w:ind w:left="2160" w:hanging="360"/>
+      </w:pPr>
+      <w:rPr>
+        <w:rFonts w:ascii="Wingdings" w:hAnsi="Wingdings" w:hint="default"/>
+        <w:sz w:val="20"/>
+      </w:rPr>
+    </w:lvl>
+    <w:lvl w:ilvl="3" w:tentative="1">
+      <w:start w:val="1"/>
+      <w:numFmt w:val="bullet"/>
+      <w:lvlText w:val=""/>
+      <w:lvlJc w:val="left"/>
+      <w:pPr>
+        <w:tabs>
+          <w:tab w:val="num" w:pos="2880"/>
+        </w:tabs>
+        <w:ind w:left="2880" w:hanging="360"/>
+      </w:pPr>
+      <w:rPr>
+        <w:rFonts w:ascii="Wingdings" w:hAnsi="Wingdings" w:hint="default"/>
+        <w:sz w:val="20"/>
+      </w:rPr>
+    </w:lvl>
+    <w:lvl w:ilvl="4" w:tentative="1">
+      <w:start w:val="1"/>
+      <w:numFmt w:val="bullet"/>
+      <w:lvlText w:val=""/>
+      <w:lvlJc w:val="left"/>
+      <w:pPr>
+        <w:tabs>
+          <w:tab w:val="num" w:pos="3600"/>
+        </w:tabs>
+        <w:ind w:left="3600" w:hanging="360"/>
+      </w:pPr>
+      <w:rPr>
+        <w:rFonts w:ascii="Wingdings" w:hAnsi="Wingdings" w:hint="default"/>
+        <w:sz w:val="20"/>
+      </w:rPr>
+    </w:lvl>
+    <w:lvl w:ilvl="5" w:tentative="1">
+      <w:start w:val="1"/>
+      <w:numFmt w:val="bullet"/>
+      <w:lvlText w:val=""/>
+      <w:lvlJc w:val="left"/>
+      <w:pPr>
+        <w:tabs>
+          <w:tab w:val="num" w:pos="4320"/>
+        </w:tabs>
+        <w:ind w:left="4320" w:hanging="360"/>
+      </w:pPr>
+      <w:rPr>
+        <w:rFonts w:ascii="Wingdings" w:hAnsi="Wingdings" w:hint="default"/>
+        <w:sz w:val="20"/>
+      </w:rPr>
+    </w:lvl>
+    <w:lvl w:ilvl="6" w:tentative="1">
+      <w:start w:val="1"/>
+      <w:numFmt w:val="bullet"/>
+      <w:lvlText w:val=""/>
+      <w:lvlJc w:val="left"/>
+      <w:pPr>
+        <w:tabs>
+          <w:tab w:val="num" w:pos="5040"/>
+        </w:tabs>
+        <w:ind w:left="5040" w:hanging="360"/>
+      </w:pPr>
+      <w:rPr>
+        <w:rFonts w:ascii="Wingdings" w:hAnsi="Wingdings" w:hint="default"/>
+        <w:sz w:val="20"/>
+      </w:rPr>
+    </w:lvl>
+    <w:lvl w:ilvl="7" w:tentative="1">
+      <w:start w:val="1"/>
+      <w:numFmt w:val="bullet"/>
+      <w:lvlText w:val=""/>
+      <w:lvlJc w:val="left"/>
+      <w:pPr>
+        <w:tabs>
+          <w:tab w:val="num" w:pos="5760"/>
+        </w:tabs>
+        <w:ind w:left="5760" w:hanging="360"/>
+      </w:pPr>
+      <w:rPr>
+        <w:rFonts w:ascii="Wingdings" w:hAnsi="Wingdings" w:hint="default"/>
+        <w:sz w:val="20"/>
+      </w:rPr>
+    </w:lvl>
+    <w:lvl w:ilvl="8" w:tentative="1">
+      <w:start w:val="1"/>
+      <w:numFmt w:val="bullet"/>
+      <w:lvlText w:val=""/>
+      <w:lvlJc w:val="left"/>
+      <w:pPr>
+        <w:tabs>
+          <w:tab w:val="num" w:pos="6480"/>
+        </w:tabs>
+        <w:ind w:left="6480" w:hanging="360"/>
+      </w:pPr>
+      <w:rPr>
+        <w:rFonts w:ascii="Wingdings" w:hAnsi="Wingdings" w:hint="default"/>
+        <w:sz w:val="20"/>
+      </w:rPr>
+    </w:lvl>
+  </w:abstractNum>
+  <w:abstractNum w:abstractNumId="5" w15:restartNumberingAfterBreak="0">
     <w:nsid w:val="09431218"/>
     <w:multiLevelType w:val="multilevel"/>
     <w:tmpl w:val="C420A600"/>
@@ -8644,7 +9865,7 @@
       </w:rPr>
     </w:lvl>
   </w:abstractNum>
-  <w:abstractNum w:abstractNumId="5" w15:restartNumberingAfterBreak="0">
+  <w:abstractNum w:abstractNumId="6" w15:restartNumberingAfterBreak="0">
     <w:nsid w:val="0D727981"/>
     <w:multiLevelType w:val="multilevel"/>
     <w:tmpl w:val="5C4C6614"/>
@@ -8793,7 +10014,7 @@
       </w:rPr>
     </w:lvl>
   </w:abstractNum>
-  <w:abstractNum w:abstractNumId="6" w15:restartNumberingAfterBreak="0">
+  <w:abstractNum w:abstractNumId="7" w15:restartNumberingAfterBreak="0">
     <w:nsid w:val="18203A87"/>
     <w:multiLevelType w:val="multilevel"/>
     <w:tmpl w:val="23E8E1EE"/>
@@ -8942,7 +10163,7 @@
       </w:rPr>
     </w:lvl>
   </w:abstractNum>
-  <w:abstractNum w:abstractNumId="7" w15:restartNumberingAfterBreak="0">
+  <w:abstractNum w:abstractNumId="8" w15:restartNumberingAfterBreak="0">
     <w:nsid w:val="18897C9D"/>
     <w:multiLevelType w:val="multilevel"/>
     <w:tmpl w:val="DA8CEDC4"/>
@@ -9055,7 +10276,7 @@
       </w:pPr>
     </w:lvl>
   </w:abstractNum>
-  <w:abstractNum w:abstractNumId="8" w15:restartNumberingAfterBreak="0">
+  <w:abstractNum w:abstractNumId="9" w15:restartNumberingAfterBreak="0">
     <w:nsid w:val="1A875798"/>
     <w:multiLevelType w:val="multilevel"/>
     <w:tmpl w:val="7AEE73C8"/>
@@ -9204,7 +10425,7 @@
       </w:rPr>
     </w:lvl>
   </w:abstractNum>
-  <w:abstractNum w:abstractNumId="9" w15:restartNumberingAfterBreak="0">
+  <w:abstractNum w:abstractNumId="10" w15:restartNumberingAfterBreak="0">
     <w:nsid w:val="1DEC15A0"/>
     <w:multiLevelType w:val="multilevel"/>
     <w:tmpl w:val="A2D66956"/>
@@ -9353,7 +10574,7 @@
       </w:rPr>
     </w:lvl>
   </w:abstractNum>
-  <w:abstractNum w:abstractNumId="10" w15:restartNumberingAfterBreak="0">
+  <w:abstractNum w:abstractNumId="11" w15:restartNumberingAfterBreak="0">
     <w:nsid w:val="1E0F5A86"/>
     <w:multiLevelType w:val="multilevel"/>
     <w:tmpl w:val="44283FDA"/>
@@ -9502,7 +10723,7 @@
       </w:rPr>
     </w:lvl>
   </w:abstractNum>
-  <w:abstractNum w:abstractNumId="11" w15:restartNumberingAfterBreak="0">
+  <w:abstractNum w:abstractNumId="12" w15:restartNumberingAfterBreak="0">
     <w:nsid w:val="210B52D4"/>
     <w:multiLevelType w:val="multilevel"/>
     <w:tmpl w:val="C55498CA"/>
@@ -9615,7 +10836,7 @@
       </w:pPr>
     </w:lvl>
   </w:abstractNum>
-  <w:abstractNum w:abstractNumId="12" w15:restartNumberingAfterBreak="0">
+  <w:abstractNum w:abstractNumId="13" w15:restartNumberingAfterBreak="0">
     <w:nsid w:val="21630C55"/>
     <w:multiLevelType w:val="multilevel"/>
     <w:tmpl w:val="812CD8A2"/>
@@ -9764,7 +10985,7 @@
       </w:rPr>
     </w:lvl>
   </w:abstractNum>
-  <w:abstractNum w:abstractNumId="13" w15:restartNumberingAfterBreak="0">
+  <w:abstractNum w:abstractNumId="14" w15:restartNumberingAfterBreak="0">
     <w:nsid w:val="27EF245D"/>
     <w:multiLevelType w:val="multilevel"/>
     <w:tmpl w:val="8C480AE0"/>
@@ -9913,7 +11134,7 @@
       </w:rPr>
     </w:lvl>
   </w:abstractNum>
-  <w:abstractNum w:abstractNumId="14" w15:restartNumberingAfterBreak="0">
+  <w:abstractNum w:abstractNumId="15" w15:restartNumberingAfterBreak="0">
     <w:nsid w:val="2B9E76E4"/>
     <w:multiLevelType w:val="multilevel"/>
     <w:tmpl w:val="D66EC024"/>
@@ -10062,7 +11283,156 @@
       </w:rPr>
     </w:lvl>
   </w:abstractNum>
-  <w:abstractNum w:abstractNumId="15" w15:restartNumberingAfterBreak="0">
+  <w:abstractNum w:abstractNumId="16" w15:restartNumberingAfterBreak="0">
+    <w:nsid w:val="2C1F5F3A"/>
+    <w:multiLevelType w:val="multilevel"/>
+    <w:tmpl w:val="1F1CF958"/>
+    <w:lvl w:ilvl="0">
+      <w:start w:val="1"/>
+      <w:numFmt w:val="bullet"/>
+      <w:lvlText w:val=""/>
+      <w:lvlJc w:val="left"/>
+      <w:pPr>
+        <w:tabs>
+          <w:tab w:val="num" w:pos="720"/>
+        </w:tabs>
+        <w:ind w:left="720" w:hanging="360"/>
+      </w:pPr>
+      <w:rPr>
+        <w:rFonts w:ascii="Symbol" w:hAnsi="Symbol" w:hint="default"/>
+        <w:sz w:val="20"/>
+      </w:rPr>
+    </w:lvl>
+    <w:lvl w:ilvl="1" w:tentative="1">
+      <w:start w:val="1"/>
+      <w:numFmt w:val="bullet"/>
+      <w:lvlText w:val="o"/>
+      <w:lvlJc w:val="left"/>
+      <w:pPr>
+        <w:tabs>
+          <w:tab w:val="num" w:pos="1440"/>
+        </w:tabs>
+        <w:ind w:left="1440" w:hanging="360"/>
+      </w:pPr>
+      <w:rPr>
+        <w:rFonts w:ascii="Courier New" w:hAnsi="Courier New" w:hint="default"/>
+        <w:sz w:val="20"/>
+      </w:rPr>
+    </w:lvl>
+    <w:lvl w:ilvl="2" w:tentative="1">
+      <w:start w:val="1"/>
+      <w:numFmt w:val="bullet"/>
+      <w:lvlText w:val=""/>
+      <w:lvlJc w:val="left"/>
+      <w:pPr>
+        <w:tabs>
+          <w:tab w:val="num" w:pos="2160"/>
+        </w:tabs>
+        <w:ind w:left="2160" w:hanging="360"/>
+      </w:pPr>
+      <w:rPr>
+        <w:rFonts w:ascii="Wingdings" w:hAnsi="Wingdings" w:hint="default"/>
+        <w:sz w:val="20"/>
+      </w:rPr>
+    </w:lvl>
+    <w:lvl w:ilvl="3" w:tentative="1">
+      <w:start w:val="1"/>
+      <w:numFmt w:val="bullet"/>
+      <w:lvlText w:val=""/>
+      <w:lvlJc w:val="left"/>
+      <w:pPr>
+        <w:tabs>
+          <w:tab w:val="num" w:pos="2880"/>
+        </w:tabs>
+        <w:ind w:left="2880" w:hanging="360"/>
+      </w:pPr>
+      <w:rPr>
+        <w:rFonts w:ascii="Wingdings" w:hAnsi="Wingdings" w:hint="default"/>
+        <w:sz w:val="20"/>
+      </w:rPr>
+    </w:lvl>
+    <w:lvl w:ilvl="4" w:tentative="1">
+      <w:start w:val="1"/>
+      <w:numFmt w:val="bullet"/>
+      <w:lvlText w:val=""/>
+      <w:lvlJc w:val="left"/>
+      <w:pPr>
+        <w:tabs>
+          <w:tab w:val="num" w:pos="3600"/>
+        </w:tabs>
+        <w:ind w:left="3600" w:hanging="360"/>
+      </w:pPr>
+      <w:rPr>
+        <w:rFonts w:ascii="Wingdings" w:hAnsi="Wingdings" w:hint="default"/>
+        <w:sz w:val="20"/>
+      </w:rPr>
+    </w:lvl>
+    <w:lvl w:ilvl="5" w:tentative="1">
+      <w:start w:val="1"/>
+      <w:numFmt w:val="bullet"/>
+      <w:lvlText w:val=""/>
+      <w:lvlJc w:val="left"/>
+      <w:pPr>
+        <w:tabs>
+          <w:tab w:val="num" w:pos="4320"/>
+        </w:tabs>
+        <w:ind w:left="4320" w:hanging="360"/>
+      </w:pPr>
+      <w:rPr>
+        <w:rFonts w:ascii="Wingdings" w:hAnsi="Wingdings" w:hint="default"/>
+        <w:sz w:val="20"/>
+      </w:rPr>
+    </w:lvl>
+    <w:lvl w:ilvl="6" w:tentative="1">
+      <w:start w:val="1"/>
+      <w:numFmt w:val="bullet"/>
+      <w:lvlText w:val=""/>
+      <w:lvlJc w:val="left"/>
+      <w:pPr>
+        <w:tabs>
+          <w:tab w:val="num" w:pos="5040"/>
+        </w:tabs>
+        <w:ind w:left="5040" w:hanging="360"/>
+      </w:pPr>
+      <w:rPr>
+        <w:rFonts w:ascii="Wingdings" w:hAnsi="Wingdings" w:hint="default"/>
+        <w:sz w:val="20"/>
+      </w:rPr>
+    </w:lvl>
+    <w:lvl w:ilvl="7" w:tentative="1">
+      <w:start w:val="1"/>
+      <w:numFmt w:val="bullet"/>
+      <w:lvlText w:val=""/>
+      <w:lvlJc w:val="left"/>
+      <w:pPr>
+        <w:tabs>
+          <w:tab w:val="num" w:pos="5760"/>
+        </w:tabs>
+        <w:ind w:left="5760" w:hanging="360"/>
+      </w:pPr>
+      <w:rPr>
+        <w:rFonts w:ascii="Wingdings" w:hAnsi="Wingdings" w:hint="default"/>
+        <w:sz w:val="20"/>
+      </w:rPr>
+    </w:lvl>
+    <w:lvl w:ilvl="8" w:tentative="1">
+      <w:start w:val="1"/>
+      <w:numFmt w:val="bullet"/>
+      <w:lvlText w:val=""/>
+      <w:lvlJc w:val="left"/>
+      <w:pPr>
+        <w:tabs>
+          <w:tab w:val="num" w:pos="6480"/>
+        </w:tabs>
+        <w:ind w:left="6480" w:hanging="360"/>
+      </w:pPr>
+      <w:rPr>
+        <w:rFonts w:ascii="Wingdings" w:hAnsi="Wingdings" w:hint="default"/>
+        <w:sz w:val="20"/>
+      </w:rPr>
+    </w:lvl>
+  </w:abstractNum>
+  <w:abstractNum w:abstractNumId="17" w15:restartNumberingAfterBreak="0">
     <w:nsid w:val="2D1D6AA9"/>
     <w:multiLevelType w:val="multilevel"/>
     <w:tmpl w:val="2C8201A0"/>
@@ -10211,7 +11581,7 @@
       </w:rPr>
     </w:lvl>
   </w:abstractNum>
-  <w:abstractNum w:abstractNumId="16" w15:restartNumberingAfterBreak="0">
+  <w:abstractNum w:abstractNumId="18" w15:restartNumberingAfterBreak="0">
     <w:nsid w:val="2D677E22"/>
     <w:multiLevelType w:val="multilevel"/>
     <w:tmpl w:val="5C687892"/>
@@ -10360,7 +11730,7 @@
       </w:rPr>
     </w:lvl>
   </w:abstractNum>
-  <w:abstractNum w:abstractNumId="17" w15:restartNumberingAfterBreak="0">
+  <w:abstractNum w:abstractNumId="19" w15:restartNumberingAfterBreak="0">
     <w:nsid w:val="2E1E753E"/>
     <w:multiLevelType w:val="multilevel"/>
     <w:tmpl w:val="4BF686DA"/>
@@ -10509,7 +11879,7 @@
       </w:rPr>
     </w:lvl>
   </w:abstractNum>
-  <w:abstractNum w:abstractNumId="18" w15:restartNumberingAfterBreak="0">
+  <w:abstractNum w:abstractNumId="20" w15:restartNumberingAfterBreak="0">
     <w:nsid w:val="2E955803"/>
     <w:multiLevelType w:val="multilevel"/>
     <w:tmpl w:val="5AA28332"/>
@@ -10658,7 +12028,7 @@
       </w:rPr>
     </w:lvl>
   </w:abstractNum>
-  <w:abstractNum w:abstractNumId="19" w15:restartNumberingAfterBreak="0">
+  <w:abstractNum w:abstractNumId="21" w15:restartNumberingAfterBreak="0">
     <w:nsid w:val="33D655AE"/>
     <w:multiLevelType w:val="multilevel"/>
     <w:tmpl w:val="85686300"/>
@@ -10807,7 +12177,7 @@
       </w:rPr>
     </w:lvl>
   </w:abstractNum>
-  <w:abstractNum w:abstractNumId="20" w15:restartNumberingAfterBreak="0">
+  <w:abstractNum w:abstractNumId="22" w15:restartNumberingAfterBreak="0">
     <w:nsid w:val="37864E72"/>
     <w:multiLevelType w:val="multilevel"/>
     <w:tmpl w:val="5A70F188"/>
@@ -10956,7 +12326,7 @@
       </w:rPr>
     </w:lvl>
   </w:abstractNum>
-  <w:abstractNum w:abstractNumId="21" w15:restartNumberingAfterBreak="0">
+  <w:abstractNum w:abstractNumId="23" w15:restartNumberingAfterBreak="0">
     <w:nsid w:val="38B119EE"/>
     <w:multiLevelType w:val="multilevel"/>
     <w:tmpl w:val="CCE651CE"/>
@@ -11105,7 +12475,7 @@
       </w:rPr>
     </w:lvl>
   </w:abstractNum>
-  <w:abstractNum w:abstractNumId="22" w15:restartNumberingAfterBreak="0">
+  <w:abstractNum w:abstractNumId="24" w15:restartNumberingAfterBreak="0">
     <w:nsid w:val="3A0B6F08"/>
     <w:multiLevelType w:val="multilevel"/>
     <w:tmpl w:val="A984C314"/>
@@ -11254,7 +12624,7 @@
       </w:rPr>
     </w:lvl>
   </w:abstractNum>
-  <w:abstractNum w:abstractNumId="23" w15:restartNumberingAfterBreak="0">
+  <w:abstractNum w:abstractNumId="25" w15:restartNumberingAfterBreak="0">
     <w:nsid w:val="3CFA70BD"/>
     <w:multiLevelType w:val="multilevel"/>
     <w:tmpl w:val="CB0640EE"/>
@@ -11403,7 +12773,7 @@
       </w:rPr>
     </w:lvl>
   </w:abstractNum>
-  <w:abstractNum w:abstractNumId="24" w15:restartNumberingAfterBreak="0">
+  <w:abstractNum w:abstractNumId="26" w15:restartNumberingAfterBreak="0">
     <w:nsid w:val="3EBF607A"/>
     <w:multiLevelType w:val="multilevel"/>
     <w:tmpl w:val="E49255A8"/>
@@ -11552,7 +12922,7 @@
       </w:rPr>
     </w:lvl>
   </w:abstractNum>
-  <w:abstractNum w:abstractNumId="25" w15:restartNumberingAfterBreak="0">
+  <w:abstractNum w:abstractNumId="27" w15:restartNumberingAfterBreak="0">
     <w:nsid w:val="429C0FD7"/>
     <w:multiLevelType w:val="multilevel"/>
     <w:tmpl w:val="C9901108"/>
@@ -11665,7 +13035,7 @@
       </w:pPr>
     </w:lvl>
   </w:abstractNum>
-  <w:abstractNum w:abstractNumId="26" w15:restartNumberingAfterBreak="0">
+  <w:abstractNum w:abstractNumId="28" w15:restartNumberingAfterBreak="0">
     <w:nsid w:val="446800BD"/>
     <w:multiLevelType w:val="multilevel"/>
     <w:tmpl w:val="224ABAC8"/>
@@ -11814,7 +13184,7 @@
       </w:rPr>
     </w:lvl>
   </w:abstractNum>
-  <w:abstractNum w:abstractNumId="27" w15:restartNumberingAfterBreak="0">
+  <w:abstractNum w:abstractNumId="29" w15:restartNumberingAfterBreak="0">
     <w:nsid w:val="450C3038"/>
     <w:multiLevelType w:val="multilevel"/>
     <w:tmpl w:val="050ABCFE"/>
@@ -11927,7 +13297,7 @@
       </w:pPr>
     </w:lvl>
   </w:abstractNum>
-  <w:abstractNum w:abstractNumId="28" w15:restartNumberingAfterBreak="0">
+  <w:abstractNum w:abstractNumId="30" w15:restartNumberingAfterBreak="0">
     <w:nsid w:val="45CB452E"/>
     <w:multiLevelType w:val="multilevel"/>
     <w:tmpl w:val="5E7071CE"/>
@@ -12076,7 +13446,7 @@
       </w:rPr>
     </w:lvl>
   </w:abstractNum>
-  <w:abstractNum w:abstractNumId="29" w15:restartNumberingAfterBreak="0">
+  <w:abstractNum w:abstractNumId="31" w15:restartNumberingAfterBreak="0">
     <w:nsid w:val="48215980"/>
     <w:multiLevelType w:val="multilevel"/>
     <w:tmpl w:val="A20AD4EA"/>
@@ -12225,7 +13595,7 @@
       </w:rPr>
     </w:lvl>
   </w:abstractNum>
-  <w:abstractNum w:abstractNumId="30" w15:restartNumberingAfterBreak="0">
+  <w:abstractNum w:abstractNumId="32" w15:restartNumberingAfterBreak="0">
     <w:nsid w:val="496E55DC"/>
     <w:multiLevelType w:val="multilevel"/>
     <w:tmpl w:val="4D0637C2"/>
@@ -12374,7 +13744,7 @@
       </w:rPr>
     </w:lvl>
   </w:abstractNum>
-  <w:abstractNum w:abstractNumId="31" w15:restartNumberingAfterBreak="0">
+  <w:abstractNum w:abstractNumId="33" w15:restartNumberingAfterBreak="0">
     <w:nsid w:val="4A630778"/>
     <w:multiLevelType w:val="multilevel"/>
     <w:tmpl w:val="498E2D66"/>
@@ -12523,7 +13893,7 @@
       </w:rPr>
     </w:lvl>
   </w:abstractNum>
-  <w:abstractNum w:abstractNumId="32" w15:restartNumberingAfterBreak="0">
+  <w:abstractNum w:abstractNumId="34" w15:restartNumberingAfterBreak="0">
     <w:nsid w:val="4EEC02C8"/>
     <w:multiLevelType w:val="multilevel"/>
     <w:tmpl w:val="C3809A86"/>
@@ -12672,7 +14042,7 @@
       </w:rPr>
     </w:lvl>
   </w:abstractNum>
-  <w:abstractNum w:abstractNumId="33" w15:restartNumberingAfterBreak="0">
+  <w:abstractNum w:abstractNumId="35" w15:restartNumberingAfterBreak="0">
     <w:nsid w:val="51DC1A2B"/>
     <w:multiLevelType w:val="multilevel"/>
     <w:tmpl w:val="28D4D844"/>
@@ -12821,7 +14191,7 @@
       </w:rPr>
     </w:lvl>
   </w:abstractNum>
-  <w:abstractNum w:abstractNumId="34" w15:restartNumberingAfterBreak="0">
+  <w:abstractNum w:abstractNumId="36" w15:restartNumberingAfterBreak="0">
     <w:nsid w:val="585E666F"/>
     <w:multiLevelType w:val="multilevel"/>
     <w:tmpl w:val="DA3CE3DE"/>
@@ -12970,7 +14340,7 @@
       </w:rPr>
     </w:lvl>
   </w:abstractNum>
-  <w:abstractNum w:abstractNumId="35" w15:restartNumberingAfterBreak="0">
+  <w:abstractNum w:abstractNumId="37" w15:restartNumberingAfterBreak="0">
     <w:nsid w:val="5A151966"/>
     <w:multiLevelType w:val="multilevel"/>
     <w:tmpl w:val="48DEDA34"/>
@@ -13119,7 +14489,7 @@
       </w:rPr>
     </w:lvl>
   </w:abstractNum>
-  <w:abstractNum w:abstractNumId="36" w15:restartNumberingAfterBreak="0">
+  <w:abstractNum w:abstractNumId="38" w15:restartNumberingAfterBreak="0">
     <w:nsid w:val="5BCC63B5"/>
     <w:multiLevelType w:val="multilevel"/>
     <w:tmpl w:val="E2126F4C"/>
@@ -13268,7 +14638,7 @@
       </w:rPr>
     </w:lvl>
   </w:abstractNum>
-  <w:abstractNum w:abstractNumId="37" w15:restartNumberingAfterBreak="0">
+  <w:abstractNum w:abstractNumId="39" w15:restartNumberingAfterBreak="0">
     <w:nsid w:val="5C7119A6"/>
     <w:multiLevelType w:val="multilevel"/>
     <w:tmpl w:val="58FE8484"/>
@@ -13417,7 +14787,7 @@
       </w:rPr>
     </w:lvl>
   </w:abstractNum>
-  <w:abstractNum w:abstractNumId="38" w15:restartNumberingAfterBreak="0">
+  <w:abstractNum w:abstractNumId="40" w15:restartNumberingAfterBreak="0">
     <w:nsid w:val="5CA97A34"/>
     <w:multiLevelType w:val="multilevel"/>
     <w:tmpl w:val="F6409E48"/>
@@ -13566,7 +14936,7 @@
       </w:rPr>
     </w:lvl>
   </w:abstractNum>
-  <w:abstractNum w:abstractNumId="39" w15:restartNumberingAfterBreak="0">
+  <w:abstractNum w:abstractNumId="41" w15:restartNumberingAfterBreak="0">
     <w:nsid w:val="60EF6EF4"/>
     <w:multiLevelType w:val="multilevel"/>
     <w:tmpl w:val="CD62C400"/>
@@ -13679,7 +15049,7 @@
       </w:pPr>
     </w:lvl>
   </w:abstractNum>
-  <w:abstractNum w:abstractNumId="40" w15:restartNumberingAfterBreak="0">
+  <w:abstractNum w:abstractNumId="42" w15:restartNumberingAfterBreak="0">
     <w:nsid w:val="64072691"/>
     <w:multiLevelType w:val="multilevel"/>
     <w:tmpl w:val="95E4E590"/>
@@ -13828,7 +15198,156 @@
       </w:rPr>
     </w:lvl>
   </w:abstractNum>
-  <w:abstractNum w:abstractNumId="41" w15:restartNumberingAfterBreak="0">
+  <w:abstractNum w:abstractNumId="43" w15:restartNumberingAfterBreak="0">
+    <w:nsid w:val="658C08F6"/>
+    <w:multiLevelType w:val="multilevel"/>
+    <w:tmpl w:val="F3CA2AF4"/>
+    <w:lvl w:ilvl="0">
+      <w:start w:val="1"/>
+      <w:numFmt w:val="bullet"/>
+      <w:lvlText w:val=""/>
+      <w:lvlJc w:val="left"/>
+      <w:pPr>
+        <w:tabs>
+          <w:tab w:val="num" w:pos="720"/>
+        </w:tabs>
+        <w:ind w:left="720" w:hanging="360"/>
+      </w:pPr>
+      <w:rPr>
+        <w:rFonts w:ascii="Symbol" w:hAnsi="Symbol" w:hint="default"/>
+        <w:sz w:val="20"/>
+      </w:rPr>
+    </w:lvl>
+    <w:lvl w:ilvl="1" w:tentative="1">
+      <w:start w:val="1"/>
+      <w:numFmt w:val="bullet"/>
+      <w:lvlText w:val="o"/>
+      <w:lvlJc w:val="left"/>
+      <w:pPr>
+        <w:tabs>
+          <w:tab w:val="num" w:pos="1440"/>
+        </w:tabs>
+        <w:ind w:left="1440" w:hanging="360"/>
+      </w:pPr>
+      <w:rPr>
+        <w:rFonts w:ascii="Courier New" w:hAnsi="Courier New" w:hint="default"/>
+        <w:sz w:val="20"/>
+      </w:rPr>
+    </w:lvl>
+    <w:lvl w:ilvl="2" w:tentative="1">
+      <w:start w:val="1"/>
+      <w:numFmt w:val="bullet"/>
+      <w:lvlText w:val=""/>
+      <w:lvlJc w:val="left"/>
+      <w:pPr>
+        <w:tabs>
+          <w:tab w:val="num" w:pos="2160"/>
+        </w:tabs>
+        <w:ind w:left="2160" w:hanging="360"/>
+      </w:pPr>
+      <w:rPr>
+        <w:rFonts w:ascii="Wingdings" w:hAnsi="Wingdings" w:hint="default"/>
+        <w:sz w:val="20"/>
+      </w:rPr>
+    </w:lvl>
+    <w:lvl w:ilvl="3" w:tentative="1">
+      <w:start w:val="1"/>
+      <w:numFmt w:val="bullet"/>
+      <w:lvlText w:val=""/>
+      <w:lvlJc w:val="left"/>
+      <w:pPr>
+        <w:tabs>
+          <w:tab w:val="num" w:pos="2880"/>
+        </w:tabs>
+        <w:ind w:left="2880" w:hanging="360"/>
+      </w:pPr>
+      <w:rPr>
+        <w:rFonts w:ascii="Wingdings" w:hAnsi="Wingdings" w:hint="default"/>
+        <w:sz w:val="20"/>
+      </w:rPr>
+    </w:lvl>
+    <w:lvl w:ilvl="4" w:tentative="1">
+      <w:start w:val="1"/>
+      <w:numFmt w:val="bullet"/>
+      <w:lvlText w:val=""/>
+      <w:lvlJc w:val="left"/>
+      <w:pPr>
+        <w:tabs>
+          <w:tab w:val="num" w:pos="3600"/>
+        </w:tabs>
+        <w:ind w:left="3600" w:hanging="360"/>
+      </w:pPr>
+      <w:rPr>
+        <w:rFonts w:ascii="Wingdings" w:hAnsi="Wingdings" w:hint="default"/>
+        <w:sz w:val="20"/>
+      </w:rPr>
+    </w:lvl>
+    <w:lvl w:ilvl="5" w:tentative="1">
+      <w:start w:val="1"/>
+      <w:numFmt w:val="bullet"/>
+      <w:lvlText w:val=""/>
+      <w:lvlJc w:val="left"/>
+      <w:pPr>
+        <w:tabs>
+          <w:tab w:val="num" w:pos="4320"/>
+        </w:tabs>
+        <w:ind w:left="4320" w:hanging="360"/>
+      </w:pPr>
+      <w:rPr>
+        <w:rFonts w:ascii="Wingdings" w:hAnsi="Wingdings" w:hint="default"/>
+        <w:sz w:val="20"/>
+      </w:rPr>
+    </w:lvl>
+    <w:lvl w:ilvl="6" w:tentative="1">
+      <w:start w:val="1"/>
+      <w:numFmt w:val="bullet"/>
+      <w:lvlText w:val=""/>
+      <w:lvlJc w:val="left"/>
+      <w:pPr>
+        <w:tabs>
+          <w:tab w:val="num" w:pos="5040"/>
+        </w:tabs>
+        <w:ind w:left="5040" w:hanging="360"/>
+      </w:pPr>
+      <w:rPr>
+        <w:rFonts w:ascii="Wingdings" w:hAnsi="Wingdings" w:hint="default"/>
+        <w:sz w:val="20"/>
+      </w:rPr>
+    </w:lvl>
+    <w:lvl w:ilvl="7" w:tentative="1">
+      <w:start w:val="1"/>
+      <w:numFmt w:val="bullet"/>
+      <w:lvlText w:val=""/>
+      <w:lvlJc w:val="left"/>
+      <w:pPr>
+        <w:tabs>
+          <w:tab w:val="num" w:pos="5760"/>
+        </w:tabs>
+        <w:ind w:left="5760" w:hanging="360"/>
+      </w:pPr>
+      <w:rPr>
+        <w:rFonts w:ascii="Wingdings" w:hAnsi="Wingdings" w:hint="default"/>
+        <w:sz w:val="20"/>
+      </w:rPr>
+    </w:lvl>
+    <w:lvl w:ilvl="8" w:tentative="1">
+      <w:start w:val="1"/>
+      <w:numFmt w:val="bullet"/>
+      <w:lvlText w:val=""/>
+      <w:lvlJc w:val="left"/>
+      <w:pPr>
+        <w:tabs>
+          <w:tab w:val="num" w:pos="6480"/>
+        </w:tabs>
+        <w:ind w:left="6480" w:hanging="360"/>
+      </w:pPr>
+      <w:rPr>
+        <w:rFonts w:ascii="Wingdings" w:hAnsi="Wingdings" w:hint="default"/>
+        <w:sz w:val="20"/>
+      </w:rPr>
+    </w:lvl>
+  </w:abstractNum>
+  <w:abstractNum w:abstractNumId="44" w15:restartNumberingAfterBreak="0">
     <w:nsid w:val="6679776E"/>
     <w:multiLevelType w:val="multilevel"/>
     <w:tmpl w:val="383A5322"/>
@@ -13977,7 +15496,7 @@
       </w:rPr>
     </w:lvl>
   </w:abstractNum>
-  <w:abstractNum w:abstractNumId="42" w15:restartNumberingAfterBreak="0">
+  <w:abstractNum w:abstractNumId="45" w15:restartNumberingAfterBreak="0">
     <w:nsid w:val="66F933F9"/>
     <w:multiLevelType w:val="multilevel"/>
     <w:tmpl w:val="24DC8B42"/>
@@ -14126,7 +15645,7 @@
       </w:rPr>
     </w:lvl>
   </w:abstractNum>
-  <w:abstractNum w:abstractNumId="43" w15:restartNumberingAfterBreak="0">
+  <w:abstractNum w:abstractNumId="46" w15:restartNumberingAfterBreak="0">
     <w:nsid w:val="66FD4F8C"/>
     <w:multiLevelType w:val="multilevel"/>
     <w:tmpl w:val="EEB8B896"/>
@@ -14275,7 +15794,7 @@
       </w:rPr>
     </w:lvl>
   </w:abstractNum>
-  <w:abstractNum w:abstractNumId="44" w15:restartNumberingAfterBreak="0">
+  <w:abstractNum w:abstractNumId="47" w15:restartNumberingAfterBreak="0">
     <w:nsid w:val="693F60F4"/>
     <w:multiLevelType w:val="multilevel"/>
     <w:tmpl w:val="94668598"/>
@@ -14424,7 +15943,7 @@
       </w:rPr>
     </w:lvl>
   </w:abstractNum>
-  <w:abstractNum w:abstractNumId="45" w15:restartNumberingAfterBreak="0">
+  <w:abstractNum w:abstractNumId="48" w15:restartNumberingAfterBreak="0">
     <w:nsid w:val="73C77D44"/>
     <w:multiLevelType w:val="multilevel"/>
     <w:tmpl w:val="BFFEE5C0"/>
@@ -14573,7 +16092,7 @@
       </w:rPr>
     </w:lvl>
   </w:abstractNum>
-  <w:abstractNum w:abstractNumId="46" w15:restartNumberingAfterBreak="0">
+  <w:abstractNum w:abstractNumId="49" w15:restartNumberingAfterBreak="0">
     <w:nsid w:val="74762A76"/>
     <w:multiLevelType w:val="multilevel"/>
     <w:tmpl w:val="737E466E"/>
@@ -14722,7 +16241,7 @@
       </w:rPr>
     </w:lvl>
   </w:abstractNum>
-  <w:abstractNum w:abstractNumId="47" w15:restartNumberingAfterBreak="0">
+  <w:abstractNum w:abstractNumId="50" w15:restartNumberingAfterBreak="0">
     <w:nsid w:val="75B61F03"/>
     <w:multiLevelType w:val="multilevel"/>
     <w:tmpl w:val="C0CE3A76"/>
@@ -14871,7 +16390,7 @@
       </w:rPr>
     </w:lvl>
   </w:abstractNum>
-  <w:abstractNum w:abstractNumId="48" w15:restartNumberingAfterBreak="0">
+  <w:abstractNum w:abstractNumId="51" w15:restartNumberingAfterBreak="0">
     <w:nsid w:val="77F36C5F"/>
     <w:multiLevelType w:val="multilevel"/>
     <w:tmpl w:val="701EC4C8"/>
@@ -15020,7 +16539,7 @@
       </w:rPr>
     </w:lvl>
   </w:abstractNum>
-  <w:abstractNum w:abstractNumId="49" w15:restartNumberingAfterBreak="0">
+  <w:abstractNum w:abstractNumId="52" w15:restartNumberingAfterBreak="0">
     <w:nsid w:val="7A317229"/>
     <w:multiLevelType w:val="multilevel"/>
     <w:tmpl w:val="D1D4282E"/>
@@ -15169,7 +16688,7 @@
       </w:rPr>
     </w:lvl>
   </w:abstractNum>
-  <w:abstractNum w:abstractNumId="50" w15:restartNumberingAfterBreak="0">
+  <w:abstractNum w:abstractNumId="53" w15:restartNumberingAfterBreak="0">
     <w:nsid w:val="7A6B3BE4"/>
     <w:multiLevelType w:val="multilevel"/>
     <w:tmpl w:val="CAF250EE"/>
@@ -15318,7 +16837,7 @@
       </w:rPr>
     </w:lvl>
   </w:abstractNum>
-  <w:abstractNum w:abstractNumId="51" w15:restartNumberingAfterBreak="0">
+  <w:abstractNum w:abstractNumId="54" w15:restartNumberingAfterBreak="0">
     <w:nsid w:val="7ABC46C2"/>
     <w:multiLevelType w:val="multilevel"/>
     <w:tmpl w:val="A52AE0DE"/>
@@ -15467,7 +16986,7 @@
       </w:rPr>
     </w:lvl>
   </w:abstractNum>
-  <w:abstractNum w:abstractNumId="52" w15:restartNumberingAfterBreak="0">
+  <w:abstractNum w:abstractNumId="55" w15:restartNumberingAfterBreak="0">
     <w:nsid w:val="7ED62B17"/>
     <w:multiLevelType w:val="multilevel"/>
     <w:tmpl w:val="77662410"/>
@@ -15616,7 +17135,7 @@
       </w:rPr>
     </w:lvl>
   </w:abstractNum>
-  <w:abstractNum w:abstractNumId="53" w15:restartNumberingAfterBreak="0">
+  <w:abstractNum w:abstractNumId="56" w15:restartNumberingAfterBreak="0">
     <w:nsid w:val="7F374048"/>
     <w:multiLevelType w:val="multilevel"/>
     <w:tmpl w:val="9C8AEA68"/>
@@ -15765,7 +17284,7 @@
       </w:rPr>
     </w:lvl>
   </w:abstractNum>
-  <w:abstractNum w:abstractNumId="54" w15:restartNumberingAfterBreak="0">
+  <w:abstractNum w:abstractNumId="57" w15:restartNumberingAfterBreak="0">
     <w:nsid w:val="7F467AF3"/>
     <w:multiLevelType w:val="multilevel"/>
     <w:tmpl w:val="17044AB0"/>
@@ -15879,169 +17398,178 @@
     </w:lvl>
   </w:abstractNum>
   <w:num w:numId="1" w16cid:durableId="494419998">
-    <w:abstractNumId w:val="53"/>
+    <w:abstractNumId w:val="56"/>
   </w:num>
   <w:num w:numId="2" w16cid:durableId="1745057727">
-    <w:abstractNumId w:val="4"/>
+    <w:abstractNumId w:val="5"/>
   </w:num>
   <w:num w:numId="3" w16cid:durableId="1755007442">
-    <w:abstractNumId w:val="21"/>
+    <w:abstractNumId w:val="23"/>
   </w:num>
   <w:num w:numId="4" w16cid:durableId="1549417367">
-    <w:abstractNumId w:val="20"/>
+    <w:abstractNumId w:val="22"/>
   </w:num>
   <w:num w:numId="5" w16cid:durableId="166946608">
-    <w:abstractNumId w:val="31"/>
+    <w:abstractNumId w:val="33"/>
   </w:num>
   <w:num w:numId="6" w16cid:durableId="619921658">
-    <w:abstractNumId w:val="51"/>
+    <w:abstractNumId w:val="54"/>
   </w:num>
   <w:num w:numId="7" w16cid:durableId="410200658">
     <w:abstractNumId w:val="2"/>
   </w:num>
   <w:num w:numId="8" w16cid:durableId="138114317">
-    <w:abstractNumId w:val="26"/>
+    <w:abstractNumId w:val="28"/>
   </w:num>
   <w:num w:numId="9" w16cid:durableId="1303845525">
-    <w:abstractNumId w:val="24"/>
+    <w:abstractNumId w:val="26"/>
   </w:num>
   <w:num w:numId="10" w16cid:durableId="1992978247">
     <w:abstractNumId w:val="1"/>
   </w:num>
   <w:num w:numId="11" w16cid:durableId="1802576842">
+    <w:abstractNumId w:val="31"/>
+  </w:num>
+  <w:num w:numId="12" w16cid:durableId="1543638704">
+    <w:abstractNumId w:val="17"/>
+  </w:num>
+  <w:num w:numId="13" w16cid:durableId="223178717">
+    <w:abstractNumId w:val="7"/>
+  </w:num>
+  <w:num w:numId="14" w16cid:durableId="1655137762">
+    <w:abstractNumId w:val="19"/>
+  </w:num>
+  <w:num w:numId="15" w16cid:durableId="643320232">
+    <w:abstractNumId w:val="35"/>
+  </w:num>
+  <w:num w:numId="16" w16cid:durableId="1751463265">
+    <w:abstractNumId w:val="46"/>
+  </w:num>
+  <w:num w:numId="17" w16cid:durableId="877281543">
+    <w:abstractNumId w:val="6"/>
+  </w:num>
+  <w:num w:numId="18" w16cid:durableId="1408842528">
+    <w:abstractNumId w:val="44"/>
+  </w:num>
+  <w:num w:numId="19" w16cid:durableId="530385472">
+    <w:abstractNumId w:val="49"/>
+  </w:num>
+  <w:num w:numId="20" w16cid:durableId="631251386">
+    <w:abstractNumId w:val="38"/>
+  </w:num>
+  <w:num w:numId="21" w16cid:durableId="1312057938">
+    <w:abstractNumId w:val="27"/>
+  </w:num>
+  <w:num w:numId="22" w16cid:durableId="1110663924">
+    <w:abstractNumId w:val="10"/>
+  </w:num>
+  <w:num w:numId="23" w16cid:durableId="1679309131">
+    <w:abstractNumId w:val="57"/>
+  </w:num>
+  <w:num w:numId="24" w16cid:durableId="543374177">
+    <w:abstractNumId w:val="13"/>
+  </w:num>
+  <w:num w:numId="25" w16cid:durableId="1738937490">
     <w:abstractNumId w:val="29"/>
   </w:num>
-  <w:num w:numId="12" w16cid:durableId="1543638704">
+  <w:num w:numId="26" w16cid:durableId="1009526698">
+    <w:abstractNumId w:val="42"/>
+  </w:num>
+  <w:num w:numId="27" w16cid:durableId="1327510338">
+    <w:abstractNumId w:val="34"/>
+  </w:num>
+  <w:num w:numId="28" w16cid:durableId="1120418649">
+    <w:abstractNumId w:val="21"/>
+  </w:num>
+  <w:num w:numId="29" w16cid:durableId="1783567440">
+    <w:abstractNumId w:val="51"/>
+  </w:num>
+  <w:num w:numId="30" w16cid:durableId="1011227361">
+    <w:abstractNumId w:val="48"/>
+  </w:num>
+  <w:num w:numId="31" w16cid:durableId="1828856574">
+    <w:abstractNumId w:val="40"/>
+  </w:num>
+  <w:num w:numId="32" w16cid:durableId="306010705">
+    <w:abstractNumId w:val="8"/>
+  </w:num>
+  <w:num w:numId="33" w16cid:durableId="113718864">
+    <w:abstractNumId w:val="11"/>
+  </w:num>
+  <w:num w:numId="34" w16cid:durableId="1680157186">
+    <w:abstractNumId w:val="41"/>
+  </w:num>
+  <w:num w:numId="35" w16cid:durableId="872812197">
+    <w:abstractNumId w:val="25"/>
+  </w:num>
+  <w:num w:numId="36" w16cid:durableId="2092651261">
+    <w:abstractNumId w:val="55"/>
+  </w:num>
+  <w:num w:numId="37" w16cid:durableId="257297255">
+    <w:abstractNumId w:val="53"/>
+  </w:num>
+  <w:num w:numId="38" w16cid:durableId="1286498176">
     <w:abstractNumId w:val="15"/>
   </w:num>
-  <w:num w:numId="13" w16cid:durableId="223178717">
-    <w:abstractNumId w:val="6"/>
+  <w:num w:numId="39" w16cid:durableId="481117337">
+    <w:abstractNumId w:val="50"/>
   </w:num>
-  <w:num w:numId="14" w16cid:durableId="1655137762">
-    <w:abstractNumId w:val="17"/>
+  <w:num w:numId="40" w16cid:durableId="664742238">
+    <w:abstractNumId w:val="39"/>
   </w:num>
-  <w:num w:numId="15" w16cid:durableId="643320232">
-    <w:abstractNumId w:val="33"/>
+  <w:num w:numId="41" w16cid:durableId="796215782">
+    <w:abstractNumId w:val="30"/>
   </w:num>
-  <w:num w:numId="16" w16cid:durableId="1751463265">
-    <w:abstractNumId w:val="43"/>
+  <w:num w:numId="42" w16cid:durableId="1571381270">
+    <w:abstractNumId w:val="20"/>
   </w:num>
-  <w:num w:numId="17" w16cid:durableId="877281543">
-    <w:abstractNumId w:val="5"/>
+  <w:num w:numId="43" w16cid:durableId="2091340873">
+    <w:abstractNumId w:val="52"/>
   </w:num>
-  <w:num w:numId="18" w16cid:durableId="1408842528">
-    <w:abstractNumId w:val="41"/>
-  </w:num>
-  <w:num w:numId="19" w16cid:durableId="530385472">
-    <w:abstractNumId w:val="46"/>
-  </w:num>
-  <w:num w:numId="20" w16cid:durableId="631251386">
-    <w:abstractNumId w:val="36"/>
-  </w:num>
-  <w:num w:numId="21" w16cid:durableId="1312057938">
-    <w:abstractNumId w:val="25"/>
-  </w:num>
-  <w:num w:numId="22" w16cid:durableId="1110663924">
-    <w:abstractNumId w:val="9"/>
-  </w:num>
-  <w:num w:numId="23" w16cid:durableId="1679309131">
-    <w:abstractNumId w:val="54"/>
-  </w:num>
-  <w:num w:numId="24" w16cid:durableId="543374177">
-    <w:abstractNumId w:val="12"/>
-  </w:num>
-  <w:num w:numId="25" w16cid:durableId="1738937490">
-    <w:abstractNumId w:val="27"/>
-  </w:num>
-  <w:num w:numId="26" w16cid:durableId="1009526698">
-    <w:abstractNumId w:val="40"/>
-  </w:num>
-  <w:num w:numId="27" w16cid:durableId="1327510338">
+  <w:num w:numId="44" w16cid:durableId="830607825">
     <w:abstractNumId w:val="32"/>
   </w:num>
-  <w:num w:numId="28" w16cid:durableId="1120418649">
-    <w:abstractNumId w:val="19"/>
-  </w:num>
-  <w:num w:numId="29" w16cid:durableId="1783567440">
-    <w:abstractNumId w:val="48"/>
-  </w:num>
-  <w:num w:numId="30" w16cid:durableId="1011227361">
-    <w:abstractNumId w:val="45"/>
-  </w:num>
-  <w:num w:numId="31" w16cid:durableId="1828856574">
-    <w:abstractNumId w:val="38"/>
-  </w:num>
-  <w:num w:numId="32" w16cid:durableId="306010705">
-    <w:abstractNumId w:val="7"/>
-  </w:num>
-  <w:num w:numId="33" w16cid:durableId="113718864">
-    <w:abstractNumId w:val="10"/>
-  </w:num>
-  <w:num w:numId="34" w16cid:durableId="1680157186">
-    <w:abstractNumId w:val="39"/>
-  </w:num>
-  <w:num w:numId="35" w16cid:durableId="872812197">
-    <w:abstractNumId w:val="23"/>
-  </w:num>
-  <w:num w:numId="36" w16cid:durableId="2092651261">
-    <w:abstractNumId w:val="52"/>
-  </w:num>
-  <w:num w:numId="37" w16cid:durableId="257297255">
-    <w:abstractNumId w:val="50"/>
-  </w:num>
-  <w:num w:numId="38" w16cid:durableId="1286498176">
+  <w:num w:numId="45" w16cid:durableId="1109549566">
     <w:abstractNumId w:val="14"/>
   </w:num>
-  <w:num w:numId="39" w16cid:durableId="481117337">
-    <w:abstractNumId w:val="47"/>
-  </w:num>
-  <w:num w:numId="40" w16cid:durableId="664742238">
-    <w:abstractNumId w:val="37"/>
-  </w:num>
-  <w:num w:numId="41" w16cid:durableId="796215782">
-    <w:abstractNumId w:val="28"/>
-  </w:num>
-  <w:num w:numId="42" w16cid:durableId="1571381270">
-    <w:abstractNumId w:val="18"/>
-  </w:num>
-  <w:num w:numId="43" w16cid:durableId="2091340873">
-    <w:abstractNumId w:val="49"/>
-  </w:num>
-  <w:num w:numId="44" w16cid:durableId="830607825">
-    <w:abstractNumId w:val="30"/>
-  </w:num>
-  <w:num w:numId="45" w16cid:durableId="1109549566">
-    <w:abstractNumId w:val="13"/>
-  </w:num>
   <w:num w:numId="46" w16cid:durableId="646859290">
-    <w:abstractNumId w:val="8"/>
+    <w:abstractNumId w:val="9"/>
   </w:num>
   <w:num w:numId="47" w16cid:durableId="427193309">
     <w:abstractNumId w:val="0"/>
   </w:num>
   <w:num w:numId="48" w16cid:durableId="1168402401">
-    <w:abstractNumId w:val="22"/>
+    <w:abstractNumId w:val="24"/>
   </w:num>
   <w:num w:numId="49" w16cid:durableId="1536191008">
-    <w:abstractNumId w:val="44"/>
+    <w:abstractNumId w:val="47"/>
   </w:num>
   <w:num w:numId="50" w16cid:durableId="1954358150">
-    <w:abstractNumId w:val="16"/>
+    <w:abstractNumId w:val="18"/>
   </w:num>
   <w:num w:numId="51" w16cid:durableId="57629073">
     <w:abstractNumId w:val="3"/>
   </w:num>
   <w:num w:numId="52" w16cid:durableId="991059372">
-    <w:abstractNumId w:val="35"/>
+    <w:abstractNumId w:val="37"/>
   </w:num>
   <w:num w:numId="53" w16cid:durableId="849953098">
-    <w:abstractNumId w:val="34"/>
+    <w:abstractNumId w:val="36"/>
   </w:num>
   <w:num w:numId="54" w16cid:durableId="106170158">
-    <w:abstractNumId w:val="42"/>
+    <w:abstractNumId w:val="45"/>
   </w:num>
   <w:num w:numId="55" w16cid:durableId="2123760266">
-    <w:abstractNumId w:val="11"/>
+    <w:abstractNumId w:val="12"/>
+  </w:num>
+  <w:num w:numId="56" w16cid:durableId="521437163">
+    <w:abstractNumId w:val="43"/>
+  </w:num>
+  <w:num w:numId="57" w16cid:durableId="616110218">
+    <w:abstractNumId w:val="16"/>
+  </w:num>
+  <w:num w:numId="58" w16cid:durableId="689993312">
+    <w:abstractNumId w:val="4"/>
   </w:num>
 </w:numbering>
 </file>

</xml_diff>